<commit_message>
Updated documentation and figures
</commit_message>
<xml_diff>
--- a/Documentation/Cookie Factory Ignition HMI Documentation.docx
+++ b/Documentation/Cookie Factory Ignition HMI Documentation.docx
@@ -28,6 +28,15 @@
     </w:p>
     <w:sdt>
       <w:sdtPr>
+        <w:rPr>
+          <w:rFonts w:asciiTheme="minorHAnsi" w:eastAsiaTheme="minorEastAsia" w:hAnsiTheme="minorHAnsi" w:cstheme="minorBidi"/>
+          <w:color w:val="auto"/>
+          <w:kern w:val="2"/>
+          <w:sz w:val="24"/>
+          <w:szCs w:val="24"/>
+          <w:lang w:eastAsia="zh-CN"/>
+          <w14:ligatures w14:val="standardContextual"/>
+        </w:rPr>
         <w:id w:val="1329948351"/>
         <w:docPartObj>
           <w:docPartGallery w:val="Table of Contents"/>
@@ -36,16 +45,9 @@
       </w:sdtPr>
       <w:sdtEndPr>
         <w:rPr>
-          <w:rFonts w:asciiTheme="minorHAnsi" w:eastAsiaTheme="minorEastAsia" w:hAnsiTheme="minorHAnsi" w:cstheme="minorBidi"/>
           <w:b/>
           <w:bCs/>
           <w:noProof/>
-          <w:color w:val="auto"/>
-          <w:kern w:val="2"/>
-          <w:sz w:val="24"/>
-          <w:szCs w:val="24"/>
-          <w:lang w:eastAsia="zh-CN"/>
-          <w14:ligatures w14:val="standardContextual"/>
         </w:rPr>
       </w:sdtEndPr>
       <w:sdtContent>
@@ -1848,25 +1850,7 @@
     </w:p>
     <w:p>
       <w:r>
-        <w:t xml:space="preserve">Note that this document is in no way complete, because the </w:t>
-      </w:r>
-      <w:r>
-        <w:t>model</w:t>
-      </w:r>
-      <w:r>
-        <w:t xml:space="preserve"> itself is not complete. </w:t>
-      </w:r>
-      <w:r>
-        <w:t>So,</w:t>
-      </w:r>
-      <w:r>
-        <w:t xml:space="preserve"> check back in the box folder for any updates to the </w:t>
-      </w:r>
-      <w:r>
-        <w:t>HMI</w:t>
-      </w:r>
-      <w:r>
-        <w:t xml:space="preserve"> and its documentation, though I will probably let you know when an update occurs.</w:t>
+        <w:t>Note that this document is in no way complete, because the model itself is not complete. So, check back in the box folder for any updates to the HMI and its documentation, though I will probably let you know when an update occurs.</w:t>
       </w:r>
     </w:p>
     <w:p>
@@ -1924,9 +1908,18 @@
           <w:sz w:val="28"/>
           <w:szCs w:val="28"/>
         </w:rPr>
-        <w:t>Connection to OpenPLC</w:t>
+        <w:t xml:space="preserve">Connection to </w:t>
+      </w:r>
+      <w:proofErr w:type="spellStart"/>
+      <w:r>
+        <w:rPr>
+          <w:sz w:val="28"/>
+          <w:szCs w:val="28"/>
+        </w:rPr>
+        <w:t>OpenPLC</w:t>
       </w:r>
       <w:bookmarkEnd w:id="4"/>
+      <w:proofErr w:type="spellEnd"/>
     </w:p>
     <w:p>
       <w:r>
@@ -1949,6 +1942,9 @@
     </w:p>
     <w:p>
       <w:r>
+        <w:rPr>
+          <w:noProof/>
+        </w:rPr>
         <w:lastRenderedPageBreak/>
         <w:drawing>
           <wp:inline distT="0" distB="0" distL="0" distR="0" wp14:anchorId="00683DE7" wp14:editId="5D2A5488">
@@ -2000,6 +1996,9 @@
     </w:p>
     <w:p>
       <w:r>
+        <w:rPr>
+          <w:noProof/>
+        </w:rPr>
         <w:drawing>
           <wp:inline distT="0" distB="0" distL="0" distR="0" wp14:anchorId="36B20581" wp14:editId="1855E3DA">
             <wp:extent cx="2804160" cy="2155641"/>
@@ -2044,6 +2043,9 @@
     </w:p>
     <w:p>
       <w:r>
+        <w:rPr>
+          <w:noProof/>
+        </w:rPr>
         <w:lastRenderedPageBreak/>
         <w:drawing>
           <wp:inline distT="0" distB="0" distL="0" distR="0" wp14:anchorId="58659989" wp14:editId="3CF1B7BB">
@@ -2084,19 +2086,20 @@
     </w:p>
     <w:p>
       <w:r>
-        <w:t xml:space="preserve">Now you’ll </w:t>
-      </w:r>
-      <w:proofErr w:type="spellStart"/>
-      <w:r>
-        <w:t>se</w:t>
-      </w:r>
-      <w:proofErr w:type="spellEnd"/>
+        <w:t>Now you’ll se</w:t>
+      </w:r>
+      <w:r>
+        <w:t>e</w:t>
+      </w:r>
       <w:r>
         <w:t xml:space="preserve"> an empty screen, we’ll want to add an OPC UA device that represents our OpenPLC device. Select “Create new Device…”</w:t>
       </w:r>
     </w:p>
     <w:p>
       <w:r>
+        <w:rPr>
+          <w:noProof/>
+        </w:rPr>
         <w:drawing>
           <wp:inline distT="0" distB="0" distL="0" distR="0" wp14:anchorId="13DFBCB2" wp14:editId="75C0BEC8">
             <wp:extent cx="5943600" cy="3023235"/>
@@ -2141,6 +2144,9 @@
     </w:p>
     <w:p>
       <w:r>
+        <w:rPr>
+          <w:noProof/>
+        </w:rPr>
         <w:lastRenderedPageBreak/>
         <w:drawing>
           <wp:inline distT="0" distB="0" distL="0" distR="0" wp14:anchorId="3B2F8176" wp14:editId="0C2E443F">
@@ -2189,6 +2195,9 @@
     </w:p>
     <w:p>
       <w:r>
+        <w:rPr>
+          <w:noProof/>
+        </w:rPr>
         <w:drawing>
           <wp:inline distT="0" distB="0" distL="0" distR="0" wp14:anchorId="1FD0039F" wp14:editId="5993663D">
             <wp:extent cx="5943600" cy="3016885"/>
@@ -2249,6 +2258,9 @@
     </w:p>
     <w:p>
       <w:r>
+        <w:rPr>
+          <w:noProof/>
+        </w:rPr>
         <w:drawing>
           <wp:inline distT="0" distB="0" distL="0" distR="0" wp14:anchorId="02F63F2E" wp14:editId="0B79EBA2">
             <wp:extent cx="5943600" cy="3026410"/>
@@ -2296,6 +2308,9 @@
     </w:p>
     <w:p>
       <w:r>
+        <w:rPr>
+          <w:noProof/>
+        </w:rPr>
         <w:drawing>
           <wp:inline distT="0" distB="0" distL="0" distR="0" wp14:anchorId="6417369C" wp14:editId="49C02B41">
             <wp:extent cx="5943600" cy="3011805"/>
@@ -2350,6 +2365,9 @@
     </w:p>
     <w:p>
       <w:r>
+        <w:rPr>
+          <w:noProof/>
+        </w:rPr>
         <w:drawing>
           <wp:inline distT="0" distB="0" distL="0" distR="0" wp14:anchorId="54C98C05" wp14:editId="3E7CD834">
             <wp:extent cx="5943600" cy="2902585"/>
@@ -2410,7 +2428,13 @@
         <w:t>button</w:t>
       </w:r>
       <w:r>
-        <w:t xml:space="preserve"> and upload the configuration file named </w:t>
+        <w:t xml:space="preserve"> and upload the </w:t>
+      </w:r>
+      <w:r>
+        <w:t xml:space="preserve">latest </w:t>
+      </w:r>
+      <w:r>
+        <w:t xml:space="preserve">configuration file named </w:t>
       </w:r>
       <w:r>
         <w:t>modbus-config.csv</w:t>
@@ -2424,6 +2448,9 @@
     </w:p>
     <w:p>
       <w:r>
+        <w:rPr>
+          <w:noProof/>
+        </w:rPr>
         <w:drawing>
           <wp:inline distT="0" distB="0" distL="0" distR="0" wp14:anchorId="377243B2" wp14:editId="341C7C25">
             <wp:extent cx="5943600" cy="1765300"/>
@@ -2473,17 +2500,26 @@
       <w:r>
         <w:t xml:space="preserve"> addressing </w:t>
       </w:r>
+      <w:r>
+        <w:t>system;</w:t>
+      </w:r>
+      <w:r>
+        <w:t xml:space="preserve"> </w:t>
+      </w:r>
       <w:proofErr w:type="gramStart"/>
       <w:r>
-        <w:t>system,</w:t>
+        <w:t>however</w:t>
       </w:r>
       <w:proofErr w:type="gramEnd"/>
       <w:r>
-        <w:t xml:space="preserve"> however you should be able to change the prefix of each address as you please. </w:t>
-      </w:r>
-    </w:p>
-    <w:p>
-      <w:r>
+        <w:t xml:space="preserve"> you should be able to change the prefix of each address as you please. </w:t>
+      </w:r>
+    </w:p>
+    <w:p>
+      <w:r>
+        <w:rPr>
+          <w:noProof/>
+        </w:rPr>
         <w:lastRenderedPageBreak/>
         <w:drawing>
           <wp:inline distT="0" distB="0" distL="0" distR="0" wp14:anchorId="08D50337" wp14:editId="56256667">
@@ -2529,6 +2565,192 @@
     </w:p>
     <w:p>
       <w:pPr>
+        <w:pStyle w:val="Heading3"/>
+      </w:pPr>
+      <w:r>
+        <w:t>Cookie tag provider</w:t>
+      </w:r>
+    </w:p>
+    <w:p>
+      <w:r>
+        <w:t>Another component that we need to set up is the cookie tag provider. Begin by navigating to Config-&gt;Tags-&gt;Realtime.</w:t>
+      </w:r>
+    </w:p>
+    <w:p>
+      <w:r>
+        <w:lastRenderedPageBreak/>
+        <w:drawing>
+          <wp:inline distT="0" distB="0" distL="0" distR="0" wp14:anchorId="18A1227C" wp14:editId="6A91986C">
+            <wp:extent cx="2428875" cy="4728589"/>
+            <wp:effectExtent l="0" t="0" r="0" b="0"/>
+            <wp:docPr id="366623475" name="Picture 1"/>
+            <wp:cNvGraphicFramePr>
+              <a:graphicFrameLocks xmlns:a="http://schemas.openxmlformats.org/drawingml/2006/main" noChangeAspect="1"/>
+            </wp:cNvGraphicFramePr>
+            <a:graphic xmlns:a="http://schemas.openxmlformats.org/drawingml/2006/main">
+              <a:graphicData uri="http://schemas.openxmlformats.org/drawingml/2006/picture">
+                <pic:pic xmlns:pic="http://schemas.openxmlformats.org/drawingml/2006/picture">
+                  <pic:nvPicPr>
+                    <pic:cNvPr id="366623475" name=""/>
+                    <pic:cNvPicPr/>
+                  </pic:nvPicPr>
+                  <pic:blipFill>
+                    <a:blip r:embed="rId24"/>
+                    <a:stretch>
+                      <a:fillRect/>
+                    </a:stretch>
+                  </pic:blipFill>
+                  <pic:spPr>
+                    <a:xfrm>
+                      <a:off x="0" y="0"/>
+                      <a:ext cx="2430158" cy="4731086"/>
+                    </a:xfrm>
+                    <a:prstGeom prst="rect">
+                      <a:avLst/>
+                    </a:prstGeom>
+                  </pic:spPr>
+                </pic:pic>
+              </a:graphicData>
+            </a:graphic>
+          </wp:inline>
+        </w:drawing>
+      </w:r>
+    </w:p>
+    <w:p>
+      <w:r>
+        <w:t>Next select “Create new Realtime Tag Provider”</w:t>
+      </w:r>
+    </w:p>
+    <w:p>
+      <w:r>
+        <w:drawing>
+          <wp:inline distT="0" distB="0" distL="0" distR="0" wp14:anchorId="1171B2E9" wp14:editId="5020C5FA">
+            <wp:extent cx="5943600" cy="1137285"/>
+            <wp:effectExtent l="0" t="0" r="0" b="5715"/>
+            <wp:docPr id="1220258124" name="Picture 1"/>
+            <wp:cNvGraphicFramePr>
+              <a:graphicFrameLocks xmlns:a="http://schemas.openxmlformats.org/drawingml/2006/main" noChangeAspect="1"/>
+            </wp:cNvGraphicFramePr>
+            <a:graphic xmlns:a="http://schemas.openxmlformats.org/drawingml/2006/main">
+              <a:graphicData uri="http://schemas.openxmlformats.org/drawingml/2006/picture">
+                <pic:pic xmlns:pic="http://schemas.openxmlformats.org/drawingml/2006/picture">
+                  <pic:nvPicPr>
+                    <pic:cNvPr id="1220258124" name=""/>
+                    <pic:cNvPicPr/>
+                  </pic:nvPicPr>
+                  <pic:blipFill>
+                    <a:blip r:embed="rId25"/>
+                    <a:stretch>
+                      <a:fillRect/>
+                    </a:stretch>
+                  </pic:blipFill>
+                  <pic:spPr>
+                    <a:xfrm>
+                      <a:off x="0" y="0"/>
+                      <a:ext cx="5943600" cy="1137285"/>
+                    </a:xfrm>
+                    <a:prstGeom prst="rect">
+                      <a:avLst/>
+                    </a:prstGeom>
+                  </pic:spPr>
+                </pic:pic>
+              </a:graphicData>
+            </a:graphic>
+          </wp:inline>
+        </w:drawing>
+      </w:r>
+    </w:p>
+    <w:p>
+      <w:r>
+        <w:t>Select next</w:t>
+      </w:r>
+    </w:p>
+    <w:p>
+      <w:r>
+        <w:drawing>
+          <wp:inline distT="0" distB="0" distL="0" distR="0" wp14:anchorId="32684D27" wp14:editId="12E639F9">
+            <wp:extent cx="5943600" cy="1173480"/>
+            <wp:effectExtent l="0" t="0" r="0" b="7620"/>
+            <wp:docPr id="582679671" name="Picture 1"/>
+            <wp:cNvGraphicFramePr>
+              <a:graphicFrameLocks xmlns:a="http://schemas.openxmlformats.org/drawingml/2006/main" noChangeAspect="1"/>
+            </wp:cNvGraphicFramePr>
+            <a:graphic xmlns:a="http://schemas.openxmlformats.org/drawingml/2006/main">
+              <a:graphicData uri="http://schemas.openxmlformats.org/drawingml/2006/picture">
+                <pic:pic xmlns:pic="http://schemas.openxmlformats.org/drawingml/2006/picture">
+                  <pic:nvPicPr>
+                    <pic:cNvPr id="582679671" name=""/>
+                    <pic:cNvPicPr/>
+                  </pic:nvPicPr>
+                  <pic:blipFill>
+                    <a:blip r:embed="rId26"/>
+                    <a:stretch>
+                      <a:fillRect/>
+                    </a:stretch>
+                  </pic:blipFill>
+                  <pic:spPr>
+                    <a:xfrm>
+                      <a:off x="0" y="0"/>
+                      <a:ext cx="5943600" cy="1173480"/>
+                    </a:xfrm>
+                    <a:prstGeom prst="rect">
+                      <a:avLst/>
+                    </a:prstGeom>
+                  </pic:spPr>
+                </pic:pic>
+              </a:graphicData>
+            </a:graphic>
+          </wp:inline>
+        </w:drawing>
+      </w:r>
+    </w:p>
+    <w:p>
+      <w:r>
+        <w:lastRenderedPageBreak/>
+        <w:t>Then name the new provider “cookie” and leave all the other settings to their default settings.</w:t>
+      </w:r>
+    </w:p>
+    <w:p>
+      <w:r>
+        <w:drawing>
+          <wp:inline distT="0" distB="0" distL="0" distR="0" wp14:anchorId="5E565162" wp14:editId="3A06BB9F">
+            <wp:extent cx="5943600" cy="5732145"/>
+            <wp:effectExtent l="0" t="0" r="0" b="1905"/>
+            <wp:docPr id="296314426" name="Picture 1"/>
+            <wp:cNvGraphicFramePr>
+              <a:graphicFrameLocks xmlns:a="http://schemas.openxmlformats.org/drawingml/2006/main" noChangeAspect="1"/>
+            </wp:cNvGraphicFramePr>
+            <a:graphic xmlns:a="http://schemas.openxmlformats.org/drawingml/2006/main">
+              <a:graphicData uri="http://schemas.openxmlformats.org/drawingml/2006/picture">
+                <pic:pic xmlns:pic="http://schemas.openxmlformats.org/drawingml/2006/picture">
+                  <pic:nvPicPr>
+                    <pic:cNvPr id="296314426" name=""/>
+                    <pic:cNvPicPr/>
+                  </pic:nvPicPr>
+                  <pic:blipFill>
+                    <a:blip r:embed="rId27"/>
+                    <a:stretch>
+                      <a:fillRect/>
+                    </a:stretch>
+                  </pic:blipFill>
+                  <pic:spPr>
+                    <a:xfrm>
+                      <a:off x="0" y="0"/>
+                      <a:ext cx="5943600" cy="5732145"/>
+                    </a:xfrm>
+                    <a:prstGeom prst="rect">
+                      <a:avLst/>
+                    </a:prstGeom>
+                  </pic:spPr>
+                </pic:pic>
+              </a:graphicData>
+            </a:graphic>
+          </wp:inline>
+        </w:drawing>
+      </w:r>
+    </w:p>
+    <w:p>
+      <w:pPr>
         <w:pStyle w:val="Heading1"/>
         <w:rPr>
           <w:sz w:val="32"/>
@@ -2567,7 +2789,11 @@
     </w:p>
     <w:p>
       <w:r>
-        <w:t>A human machine interface (HMI) is a system that allows people to interact and control different physical processes, systems, or machines. Typically, an HMI allows the user to see a simplified view of different systems and their relative information.  Multiple HMIs may exist within a single physical facility, often encompassing different parts of facilities operations. Currently, the project file uploaded to box contains the HMI that represents the ingredient allocation process of the Cookie Factory Model.</w:t>
+        <w:t xml:space="preserve">A human machine interface (HMI) is a system that allows people to interact and control different physical processes, systems, or machines. Typically, an HMI allows the user to see a simplified view of different systems and their relative information.  Multiple HMIs may </w:t>
+      </w:r>
+      <w:r>
+        <w:lastRenderedPageBreak/>
+        <w:t>exist within a single physical facility, often encompassing different parts of facilities operations. Currently, the project file uploaded to box contains the HMI that represents the ingredient allocation process of the Cookie Factory Model.</w:t>
       </w:r>
     </w:p>
     <w:p>
@@ -2610,7 +2836,7 @@
       <w:r>
         <w:br/>
       </w:r>
-      <w:hyperlink r:id="rId24" w:history="1">
+      <w:hyperlink r:id="rId28" w:anchor="adding-applications" w:history="1">
         <w:r>
           <w:rPr>
             <w:rStyle w:val="Hyperlink"/>
@@ -2621,7 +2847,9 @@
     </w:p>
     <w:p>
       <w:r>
-        <w:lastRenderedPageBreak/>
+        <w:rPr>
+          <w:noProof/>
+        </w:rPr>
         <w:drawing>
           <wp:inline distT="0" distB="0" distL="0" distR="0" wp14:anchorId="358E225C" wp14:editId="605F8547">
             <wp:extent cx="3293465" cy="2613660"/>
@@ -2638,7 +2866,7 @@
                     <pic:cNvPicPr/>
                   </pic:nvPicPr>
                   <pic:blipFill>
-                    <a:blip r:embed="rId25"/>
+                    <a:blip r:embed="rId29"/>
                     <a:stretch>
                       <a:fillRect/>
                     </a:stretch>
@@ -2661,6 +2889,9 @@
     </w:p>
     <w:p>
       <w:r>
+        <w:rPr>
+          <w:noProof/>
+        </w:rPr>
         <w:drawing>
           <wp:inline distT="0" distB="0" distL="0" distR="0" wp14:anchorId="61DEF971" wp14:editId="6DAFDF0F">
             <wp:extent cx="3304665" cy="2537460"/>
@@ -2677,7 +2908,7 @@
                     <pic:cNvPicPr/>
                   </pic:nvPicPr>
                   <pic:blipFill>
-                    <a:blip r:embed="rId26"/>
+                    <a:blip r:embed="rId30"/>
                     <a:stretch>
                       <a:fillRect/>
                     </a:stretch>
@@ -2700,6 +2931,7 @@
     </w:p>
     <w:p>
       <w:r>
+        <w:lastRenderedPageBreak/>
         <w:t>Select your new designer and open it.</w:t>
       </w:r>
       <w:r>
@@ -2711,7 +2943,9 @@
     </w:p>
     <w:p>
       <w:r>
-        <w:lastRenderedPageBreak/>
+        <w:rPr>
+          <w:noProof/>
+        </w:rPr>
         <w:drawing>
           <wp:inline distT="0" distB="0" distL="0" distR="0" wp14:anchorId="4AAB8F3B" wp14:editId="32A2B8BB">
             <wp:extent cx="3276600" cy="2596776"/>
@@ -2728,7 +2962,7 @@
                     <pic:cNvPicPr/>
                   </pic:nvPicPr>
                   <pic:blipFill>
-                    <a:blip r:embed="rId27"/>
+                    <a:blip r:embed="rId31"/>
                     <a:stretch>
                       <a:fillRect/>
                     </a:stretch>
@@ -2759,6 +2993,9 @@
     </w:p>
     <w:p>
       <w:r>
+        <w:rPr>
+          <w:noProof/>
+        </w:rPr>
         <w:drawing>
           <wp:inline distT="0" distB="0" distL="0" distR="0" wp14:anchorId="2D5D729D" wp14:editId="46B01538">
             <wp:extent cx="3825240" cy="3085530"/>
@@ -2775,7 +3012,7 @@
                     <pic:cNvPicPr/>
                   </pic:nvPicPr>
                   <pic:blipFill>
-                    <a:blip r:embed="rId28"/>
+                    <a:blip r:embed="rId32"/>
                     <a:stretch>
                       <a:fillRect/>
                     </a:stretch>
@@ -2804,10 +3041,13 @@
         <w:t xml:space="preserve">where you can select your project zip file. For the cookie factory download and select the project zip file located in box named </w:t>
       </w:r>
       <w:r>
-        <w:t>ManufacturingModel_CookieFactory_2025_2025-06-02_1644</w:t>
-      </w:r>
-      <w:r>
-        <w:t xml:space="preserve"> in the same directory as this </w:t>
+        <w:t>ManufacturingModel_CookieFactory_2025-12-30_1155</w:t>
+      </w:r>
+      <w:r>
+        <w:t xml:space="preserve"> </w:t>
+      </w:r>
+      <w:r>
+        <w:t xml:space="preserve">in the same directory as this </w:t>
       </w:r>
       <w:r>
         <w:lastRenderedPageBreak/>
@@ -2818,10 +3058,10 @@
       </w:r>
       <w:r>
         <w:drawing>
-          <wp:inline distT="0" distB="0" distL="0" distR="0" wp14:anchorId="0E247DA9" wp14:editId="5D67F0C3">
-            <wp:extent cx="5943600" cy="3192780"/>
-            <wp:effectExtent l="0" t="0" r="0" b="7620"/>
-            <wp:docPr id="2068192092" name="Picture 1" descr="A screenshot of a computer&#10;&#10;AI-generated content may be incorrect."/>
+          <wp:inline distT="0" distB="0" distL="0" distR="0" wp14:anchorId="501ED474" wp14:editId="25EFEB68">
+            <wp:extent cx="4865649" cy="3238500"/>
+            <wp:effectExtent l="0" t="0" r="0" b="0"/>
+            <wp:docPr id="260929379" name="Picture 1"/>
             <wp:cNvGraphicFramePr>
               <a:graphicFrameLocks xmlns:a="http://schemas.openxmlformats.org/drawingml/2006/main" noChangeAspect="1"/>
             </wp:cNvGraphicFramePr>
@@ -2829,11 +3069,11 @@
               <a:graphicData uri="http://schemas.openxmlformats.org/drawingml/2006/picture">
                 <pic:pic xmlns:pic="http://schemas.openxmlformats.org/drawingml/2006/picture">
                   <pic:nvPicPr>
-                    <pic:cNvPr id="2068192092" name="Picture 1" descr="A screenshot of a computer&#10;&#10;AI-generated content may be incorrect."/>
+                    <pic:cNvPr id="260929379" name=""/>
                     <pic:cNvPicPr/>
                   </pic:nvPicPr>
                   <pic:blipFill>
-                    <a:blip r:embed="rId29"/>
+                    <a:blip r:embed="rId33"/>
                     <a:stretch>
                       <a:fillRect/>
                     </a:stretch>
@@ -2841,7 +3081,7 @@
                   <pic:spPr>
                     <a:xfrm>
                       <a:off x="0" y="0"/>
-                      <a:ext cx="5943600" cy="3192780"/>
+                      <a:ext cx="4869468" cy="3241042"/>
                     </a:xfrm>
                     <a:prstGeom prst="rect">
                       <a:avLst/>
@@ -2856,17 +3096,23 @@
     </w:p>
     <w:p>
       <w:r>
-        <w:t>Next you should see a screen showing all the project configurations, leave these as is and then select “Import Project” as shown below.</w:t>
+        <w:t>Next you should see a screen showing all the project configurations, leave these as is and then select “Import Project” as shown below</w:t>
+      </w:r>
+      <w:r>
+        <w:t>, with the default tag provider set to “cookie”</w:t>
+      </w:r>
+      <w:r>
+        <w:t>.</w:t>
       </w:r>
       <w:r>
         <w:br/>
       </w:r>
       <w:r>
         <w:drawing>
-          <wp:inline distT="0" distB="0" distL="0" distR="0" wp14:anchorId="777AEC45" wp14:editId="09968CA2">
-            <wp:extent cx="4091940" cy="3307651"/>
-            <wp:effectExtent l="0" t="0" r="3810" b="7620"/>
-            <wp:docPr id="181902351" name="Picture 1" descr="A screenshot of a computer&#10;&#10;AI-generated content may be incorrect."/>
+          <wp:inline distT="0" distB="0" distL="0" distR="0" wp14:anchorId="12465D81" wp14:editId="0E8A602D">
+            <wp:extent cx="4619625" cy="3764302"/>
+            <wp:effectExtent l="0" t="0" r="0" b="7620"/>
+            <wp:docPr id="1529904947" name="Picture 1"/>
             <wp:cNvGraphicFramePr>
               <a:graphicFrameLocks xmlns:a="http://schemas.openxmlformats.org/drawingml/2006/main" noChangeAspect="1"/>
             </wp:cNvGraphicFramePr>
@@ -2874,11 +3120,11 @@
               <a:graphicData uri="http://schemas.openxmlformats.org/drawingml/2006/picture">
                 <pic:pic xmlns:pic="http://schemas.openxmlformats.org/drawingml/2006/picture">
                   <pic:nvPicPr>
-                    <pic:cNvPr id="181902351" name="Picture 1" descr="A screenshot of a computer&#10;&#10;AI-generated content may be incorrect."/>
+                    <pic:cNvPr id="1529904947" name=""/>
                     <pic:cNvPicPr/>
                   </pic:nvPicPr>
                   <pic:blipFill>
-                    <a:blip r:embed="rId30"/>
+                    <a:blip r:embed="rId34"/>
                     <a:stretch>
                       <a:fillRect/>
                     </a:stretch>
@@ -2886,7 +3132,7 @@
                   <pic:spPr>
                     <a:xfrm>
                       <a:off x="0" y="0"/>
-                      <a:ext cx="4098605" cy="3313039"/>
+                      <a:ext cx="4629543" cy="3772384"/>
                     </a:xfrm>
                     <a:prstGeom prst="rect">
                       <a:avLst/>
@@ -2907,14 +3153,12 @@
       <w:r>
         <w:br/>
       </w:r>
-    </w:p>
-    <w:p>
       <w:r>
         <w:drawing>
-          <wp:inline distT="0" distB="0" distL="0" distR="0" wp14:anchorId="4E7C3283" wp14:editId="5C43F829">
-            <wp:extent cx="4464768" cy="1729740"/>
-            <wp:effectExtent l="0" t="0" r="0" b="3810"/>
-            <wp:docPr id="1329275600" name="Picture 1" descr="A screenshot of a computer&#10;&#10;AI-generated content may be incorrect."/>
+          <wp:inline distT="0" distB="0" distL="0" distR="0" wp14:anchorId="05034CB6" wp14:editId="1F0D79A4">
+            <wp:extent cx="5066714" cy="1790700"/>
+            <wp:effectExtent l="0" t="0" r="635" b="0"/>
+            <wp:docPr id="573922657" name="Picture 1"/>
             <wp:cNvGraphicFramePr>
               <a:graphicFrameLocks xmlns:a="http://schemas.openxmlformats.org/drawingml/2006/main" noChangeAspect="1"/>
             </wp:cNvGraphicFramePr>
@@ -2922,18 +3166,20 @@
               <a:graphicData uri="http://schemas.openxmlformats.org/drawingml/2006/picture">
                 <pic:pic xmlns:pic="http://schemas.openxmlformats.org/drawingml/2006/picture">
                   <pic:nvPicPr>
-                    <pic:cNvPr id="1329275600" name="Picture 1" descr="A screenshot of a computer&#10;&#10;AI-generated content may be incorrect."/>
+                    <pic:cNvPr id="573922657" name=""/>
                     <pic:cNvPicPr/>
                   </pic:nvPicPr>
                   <pic:blipFill rotWithShape="1">
-                    <a:blip r:embed="rId31"/>
-                    <a:srcRect b="52084"/>
-                    <a:stretch/>
+                    <a:blip r:embed="rId35"/>
+                    <a:srcRect b="56502"/>
+                    <a:stretch>
+                      <a:fillRect/>
+                    </a:stretch>
                   </pic:blipFill>
                   <pic:spPr bwMode="auto">
                     <a:xfrm>
                       <a:off x="0" y="0"/>
-                      <a:ext cx="4481202" cy="1736107"/>
+                      <a:ext cx="5072014" cy="1792573"/>
                     </a:xfrm>
                     <a:prstGeom prst="rect">
                       <a:avLst/>
@@ -2954,35 +3200,32 @@
         </w:drawing>
       </w:r>
     </w:p>
-    <w:p/>
-    <w:p>
-      <w:r>
-        <w:t>Congratulations! You have now opened the project file, next navigate to View-&gt;Windows-&gt;</w:t>
-      </w:r>
-      <w:proofErr w:type="spellStart"/>
-      <w:r>
-        <w:t>Main_View</w:t>
-      </w:r>
-      <w:proofErr w:type="spellEnd"/>
-      <w:r>
-        <w:t xml:space="preserve"> as shown below. Double click on </w:t>
-      </w:r>
-      <w:proofErr w:type="spellStart"/>
-      <w:r>
-        <w:t>Main_View</w:t>
-      </w:r>
-      <w:proofErr w:type="spellEnd"/>
-      <w:r>
-        <w:t>.</w:t>
+    <w:p>
+      <w:r>
+        <w:t xml:space="preserve">Congratulations! You have now opened the project </w:t>
+      </w:r>
+      <w:proofErr w:type="gramStart"/>
+      <w:r>
+        <w:t>file,</w:t>
+      </w:r>
+      <w:proofErr w:type="gramEnd"/>
+      <w:r>
+        <w:t xml:space="preserve"> </w:t>
+      </w:r>
+      <w:r>
+        <w:t xml:space="preserve">next we need to import our tags into our tag browser in the bottom left. Select the three dots in the tag browser pane </w:t>
+      </w:r>
+      <w:r>
+        <w:t xml:space="preserve">then import tags and then finally direct. </w:t>
       </w:r>
     </w:p>
     <w:p>
       <w:r>
         <w:drawing>
-          <wp:inline distT="0" distB="0" distL="0" distR="0" wp14:anchorId="623D22AD" wp14:editId="73DFA4D6">
-            <wp:extent cx="3322320" cy="2853711"/>
-            <wp:effectExtent l="0" t="0" r="0" b="3810"/>
-            <wp:docPr id="1879235050" name="Picture 1" descr="A screenshot of a computer&#10;&#10;AI-generated content may be incorrect."/>
+          <wp:inline distT="0" distB="0" distL="0" distR="0" wp14:anchorId="0CF2DD48" wp14:editId="4CC0C5CE">
+            <wp:extent cx="2962421" cy="4643562"/>
+            <wp:effectExtent l="0" t="0" r="0" b="5080"/>
+            <wp:docPr id="266851091" name="Picture 1"/>
             <wp:cNvGraphicFramePr>
               <a:graphicFrameLocks xmlns:a="http://schemas.openxmlformats.org/drawingml/2006/main" noChangeAspect="1"/>
             </wp:cNvGraphicFramePr>
@@ -2990,246 +3233,7 @@
               <a:graphicData uri="http://schemas.openxmlformats.org/drawingml/2006/picture">
                 <pic:pic xmlns:pic="http://schemas.openxmlformats.org/drawingml/2006/picture">
                   <pic:nvPicPr>
-                    <pic:cNvPr id="1879235050" name="Picture 1" descr="A screenshot of a computer&#10;&#10;AI-generated content may be incorrect."/>
-                    <pic:cNvPicPr/>
-                  </pic:nvPicPr>
-                  <pic:blipFill>
-                    <a:blip r:embed="rId32"/>
-                    <a:stretch>
-                      <a:fillRect/>
-                    </a:stretch>
-                  </pic:blipFill>
-                  <pic:spPr>
-                    <a:xfrm>
-                      <a:off x="0" y="0"/>
-                      <a:ext cx="3330908" cy="2861088"/>
-                    </a:xfrm>
-                    <a:prstGeom prst="rect">
-                      <a:avLst/>
-                    </a:prstGeom>
-                  </pic:spPr>
-                </pic:pic>
-              </a:graphicData>
-            </a:graphic>
-          </wp:inline>
-        </w:drawing>
-      </w:r>
-    </w:p>
-    <w:p>
-      <w:r>
-        <w:t xml:space="preserve">After opening </w:t>
-      </w:r>
-      <w:proofErr w:type="spellStart"/>
-      <w:r>
-        <w:t>Main_View</w:t>
-      </w:r>
-      <w:proofErr w:type="spellEnd"/>
-      <w:r>
-        <w:t xml:space="preserve"> you </w:t>
-      </w:r>
-      <w:r>
-        <w:t>should see the following</w:t>
-      </w:r>
-      <w:r>
-        <w:t>:</w:t>
-      </w:r>
-    </w:p>
-    <w:p>
-      <w:r>
-        <w:lastRenderedPageBreak/>
-        <w:drawing>
-          <wp:inline distT="0" distB="0" distL="0" distR="0" wp14:anchorId="7B78B256" wp14:editId="5A52BFC2">
-            <wp:extent cx="5943600" cy="3246755"/>
-            <wp:effectExtent l="0" t="0" r="0" b="0"/>
-            <wp:docPr id="1145821241" name="Picture 1" descr="A screenshot of a computer&#10;&#10;AI-generated content may be incorrect."/>
-            <wp:cNvGraphicFramePr>
-              <a:graphicFrameLocks xmlns:a="http://schemas.openxmlformats.org/drawingml/2006/main" noChangeAspect="1"/>
-            </wp:cNvGraphicFramePr>
-            <a:graphic xmlns:a="http://schemas.openxmlformats.org/drawingml/2006/main">
-              <a:graphicData uri="http://schemas.openxmlformats.org/drawingml/2006/picture">
-                <pic:pic xmlns:pic="http://schemas.openxmlformats.org/drawingml/2006/picture">
-                  <pic:nvPicPr>
-                    <pic:cNvPr id="1145821241" name="Picture 1" descr="A screenshot of a computer&#10;&#10;AI-generated content may be incorrect."/>
-                    <pic:cNvPicPr/>
-                  </pic:nvPicPr>
-                  <pic:blipFill>
-                    <a:blip r:embed="rId33"/>
-                    <a:stretch>
-                      <a:fillRect/>
-                    </a:stretch>
-                  </pic:blipFill>
-                  <pic:spPr>
-                    <a:xfrm>
-                      <a:off x="0" y="0"/>
-                      <a:ext cx="5943600" cy="3246755"/>
-                    </a:xfrm>
-                    <a:prstGeom prst="rect">
-                      <a:avLst/>
-                    </a:prstGeom>
-                  </pic:spPr>
-                </pic:pic>
-              </a:graphicData>
-            </a:graphic>
-          </wp:inline>
-        </w:drawing>
-      </w:r>
-    </w:p>
-    <w:p>
-      <w:r>
-        <w:t xml:space="preserve">If you see any errors, such as “Trial Expired” or the tag values in red font, be sure to reset your trial in the ignition gateway or ensure you are connected to the OpenPLC runtime instance. </w:t>
-      </w:r>
-    </w:p>
-    <w:p>
-      <w:r>
-        <w:t xml:space="preserve">There are three main windows in Ignition Designer that you should direct your attention to. First there is the </w:t>
-      </w:r>
-      <w:r>
-        <w:t>“Project</w:t>
-      </w:r>
-      <w:r>
-        <w:t xml:space="preserve"> </w:t>
-      </w:r>
-      <w:r>
-        <w:t>Browser”</w:t>
-      </w:r>
-      <w:r>
-        <w:t xml:space="preserve"> which shows all project components from scripts to visual elements</w:t>
-      </w:r>
-      <w:r>
-        <w:t>, alarms, reports, and database queries</w:t>
-      </w:r>
-      <w:r>
-        <w:t xml:space="preserve">. </w:t>
-      </w:r>
-    </w:p>
-    <w:p>
-      <w:r>
-        <w:drawing>
-          <wp:inline distT="0" distB="0" distL="0" distR="0" wp14:anchorId="60935FC9" wp14:editId="61C4C6D8">
-            <wp:extent cx="2969467" cy="2827020"/>
-            <wp:effectExtent l="0" t="0" r="2540" b="0"/>
-            <wp:docPr id="1493238065" name="Picture 1" descr="A screenshot of a computer&#10;&#10;AI-generated content may be incorrect."/>
-            <wp:cNvGraphicFramePr>
-              <a:graphicFrameLocks xmlns:a="http://schemas.openxmlformats.org/drawingml/2006/main" noChangeAspect="1"/>
-            </wp:cNvGraphicFramePr>
-            <a:graphic xmlns:a="http://schemas.openxmlformats.org/drawingml/2006/main">
-              <a:graphicData uri="http://schemas.openxmlformats.org/drawingml/2006/picture">
-                <pic:pic xmlns:pic="http://schemas.openxmlformats.org/drawingml/2006/picture">
-                  <pic:nvPicPr>
-                    <pic:cNvPr id="1493238065" name="Picture 1" descr="A screenshot of a computer&#10;&#10;AI-generated content may be incorrect."/>
-                    <pic:cNvPicPr/>
-                  </pic:nvPicPr>
-                  <pic:blipFill>
-                    <a:blip r:embed="rId34"/>
-                    <a:stretch>
-                      <a:fillRect/>
-                    </a:stretch>
-                  </pic:blipFill>
-                  <pic:spPr>
-                    <a:xfrm>
-                      <a:off x="0" y="0"/>
-                      <a:ext cx="2971134" cy="2828607"/>
-                    </a:xfrm>
-                    <a:prstGeom prst="rect">
-                      <a:avLst/>
-                    </a:prstGeom>
-                  </pic:spPr>
-                </pic:pic>
-              </a:graphicData>
-            </a:graphic>
-          </wp:inline>
-        </w:drawing>
-      </w:r>
-    </w:p>
-    <w:p>
-      <w:r>
-        <w:lastRenderedPageBreak/>
-        <w:t xml:space="preserve">Next is the “Tag Browser” where you can see all the tags included in the HMI, these numbers will change as the python simulation runs in accordance with an operator’s inputs into the HMI. </w:t>
-      </w:r>
-    </w:p>
-    <w:p>
-      <w:r>
-        <w:drawing>
-          <wp:inline distT="0" distB="0" distL="0" distR="0" wp14:anchorId="4A917033" wp14:editId="23053F76">
-            <wp:extent cx="3032754" cy="2910840"/>
-            <wp:effectExtent l="0" t="0" r="0" b="3810"/>
-            <wp:docPr id="1269988648" name="Picture 1" descr="A screenshot of a computer&#10;&#10;AI-generated content may be incorrect."/>
-            <wp:cNvGraphicFramePr>
-              <a:graphicFrameLocks xmlns:a="http://schemas.openxmlformats.org/drawingml/2006/main" noChangeAspect="1"/>
-            </wp:cNvGraphicFramePr>
-            <a:graphic xmlns:a="http://schemas.openxmlformats.org/drawingml/2006/main">
-              <a:graphicData uri="http://schemas.openxmlformats.org/drawingml/2006/picture">
-                <pic:pic xmlns:pic="http://schemas.openxmlformats.org/drawingml/2006/picture">
-                  <pic:nvPicPr>
-                    <pic:cNvPr id="1269988648" name="Picture 1" descr="A screenshot of a computer&#10;&#10;AI-generated content may be incorrect."/>
-                    <pic:cNvPicPr/>
-                  </pic:nvPicPr>
-                  <pic:blipFill rotWithShape="1">
-                    <a:blip r:embed="rId35"/>
-                    <a:srcRect b="17406"/>
-                    <a:stretch/>
-                  </pic:blipFill>
-                  <pic:spPr bwMode="auto">
-                    <a:xfrm>
-                      <a:off x="0" y="0"/>
-                      <a:ext cx="3034623" cy="2912634"/>
-                    </a:xfrm>
-                    <a:prstGeom prst="rect">
-                      <a:avLst/>
-                    </a:prstGeom>
-                    <a:ln>
-                      <a:noFill/>
-                    </a:ln>
-                    <a:extLst>
-                      <a:ext uri="{53640926-AAD7-44D8-BBD7-CCE9431645EC}">
-                        <a14:shadowObscured xmlns:a14="http://schemas.microsoft.com/office/drawing/2010/main"/>
-                      </a:ext>
-                    </a:extLst>
-                  </pic:spPr>
-                </pic:pic>
-              </a:graphicData>
-            </a:graphic>
-          </wp:inline>
-        </w:drawing>
-      </w:r>
-    </w:p>
-    <w:p>
-      <w:r>
-        <w:t xml:space="preserve">Finally, you have the main window which will show you the HMI in </w:t>
-      </w:r>
-      <w:proofErr w:type="gramStart"/>
-      <w:r>
-        <w:t>it’s</w:t>
-      </w:r>
-      <w:proofErr w:type="gramEnd"/>
-      <w:r>
-        <w:t xml:space="preserve"> current state. Each numeric value, two state toggle, and alarm is tied to a tag. The tag values will change in accordance with the HMI and these changes will also be reflected in </w:t>
-      </w:r>
-      <w:proofErr w:type="spellStart"/>
-      <w:r>
-        <w:t>OpenPLC’s</w:t>
-      </w:r>
-      <w:proofErr w:type="spellEnd"/>
-      <w:r>
-        <w:t xml:space="preserve"> monitor. </w:t>
-      </w:r>
-    </w:p>
-    <w:p>
-      <w:r>
-        <w:lastRenderedPageBreak/>
-        <w:drawing>
-          <wp:inline distT="0" distB="0" distL="0" distR="0" wp14:anchorId="16D86363" wp14:editId="57256247">
-            <wp:extent cx="5943600" cy="4504055"/>
-            <wp:effectExtent l="0" t="0" r="0" b="0"/>
-            <wp:docPr id="932329684" name="Picture 1" descr="A computer screen shot of a computer&#10;&#10;AI-generated content may be incorrect."/>
-            <wp:cNvGraphicFramePr>
-              <a:graphicFrameLocks xmlns:a="http://schemas.openxmlformats.org/drawingml/2006/main" noChangeAspect="1"/>
-            </wp:cNvGraphicFramePr>
-            <a:graphic xmlns:a="http://schemas.openxmlformats.org/drawingml/2006/main">
-              <a:graphicData uri="http://schemas.openxmlformats.org/drawingml/2006/picture">
-                <pic:pic xmlns:pic="http://schemas.openxmlformats.org/drawingml/2006/picture">
-                  <pic:nvPicPr>
-                    <pic:cNvPr id="932329684" name="Picture 1" descr="A computer screen shot of a computer&#10;&#10;AI-generated content may be incorrect."/>
+                    <pic:cNvPr id="266851091" name=""/>
                     <pic:cNvPicPr/>
                   </pic:nvPicPr>
                   <pic:blipFill>
@@ -3241,7 +3245,7 @@
                   <pic:spPr>
                     <a:xfrm>
                       <a:off x="0" y="0"/>
-                      <a:ext cx="5943600" cy="4504055"/>
+                      <a:ext cx="2971239" cy="4657384"/>
                     </a:xfrm>
                     <a:prstGeom prst="rect">
                       <a:avLst/>
@@ -3256,17 +3260,25 @@
     </w:p>
     <w:p>
       <w:r>
-        <w:t>To manipulate these values, we first must enable read/write mode and then preview mode. This will allow us to click each two-state toggle and change the values accordingly.</w:t>
-      </w:r>
-    </w:p>
-    <w:p>
-      <w:r>
         <w:lastRenderedPageBreak/>
+        <w:t xml:space="preserve">This should open your file browser where you can select the cookie-factory-tags_2025_12_31_1118 </w:t>
+      </w:r>
+      <w:proofErr w:type="spellStart"/>
+      <w:r>
+        <w:t>json</w:t>
+      </w:r>
+      <w:proofErr w:type="spellEnd"/>
+      <w:r>
+        <w:t xml:space="preserve"> file.</w:t>
+      </w:r>
+    </w:p>
+    <w:p>
+      <w:r>
         <w:drawing>
-          <wp:inline distT="0" distB="0" distL="0" distR="0" wp14:anchorId="6815CB87" wp14:editId="64984E80">
-            <wp:extent cx="5943600" cy="3782695"/>
-            <wp:effectExtent l="0" t="0" r="0" b="8255"/>
-            <wp:docPr id="644510581" name="Picture 1" descr="A screenshot of a computer&#10;&#10;AI-generated content may be incorrect."/>
+          <wp:inline distT="0" distB="0" distL="0" distR="0" wp14:anchorId="25F743F5" wp14:editId="7ECD9C75">
+            <wp:extent cx="4094922" cy="2687502"/>
+            <wp:effectExtent l="0" t="0" r="1270" b="0"/>
+            <wp:docPr id="1886632927" name="Picture 1"/>
             <wp:cNvGraphicFramePr>
               <a:graphicFrameLocks xmlns:a="http://schemas.openxmlformats.org/drawingml/2006/main" noChangeAspect="1"/>
             </wp:cNvGraphicFramePr>
@@ -3274,7 +3286,7 @@
               <a:graphicData uri="http://schemas.openxmlformats.org/drawingml/2006/picture">
                 <pic:pic xmlns:pic="http://schemas.openxmlformats.org/drawingml/2006/picture">
                   <pic:nvPicPr>
-                    <pic:cNvPr id="644510581" name="Picture 1" descr="A screenshot of a computer&#10;&#10;AI-generated content may be incorrect."/>
+                    <pic:cNvPr id="1886632927" name=""/>
                     <pic:cNvPicPr/>
                   </pic:nvPicPr>
                   <pic:blipFill>
@@ -3286,7 +3298,7 @@
                   <pic:spPr>
                     <a:xfrm>
                       <a:off x="0" y="0"/>
-                      <a:ext cx="5943600" cy="3782695"/>
+                      <a:ext cx="4101129" cy="2691575"/>
                     </a:xfrm>
                     <a:prstGeom prst="rect">
                       <a:avLst/>
@@ -3301,475 +3313,41 @@
     </w:p>
     <w:p>
       <w:r>
-        <w:t xml:space="preserve">Congratulations! </w:t>
-      </w:r>
-      <w:r>
-        <w:t xml:space="preserve">Now you should </w:t>
-      </w:r>
-      <w:r>
-        <w:t>understand</w:t>
-      </w:r>
-      <w:r>
-        <w:t xml:space="preserve"> how to load a project into </w:t>
-      </w:r>
-      <w:proofErr w:type="gramStart"/>
-      <w:r>
-        <w:t>Ignition</w:t>
-      </w:r>
-      <w:proofErr w:type="gramEnd"/>
-      <w:r>
-        <w:t xml:space="preserve"> Designer</w:t>
-      </w:r>
-      <w:r>
-        <w:t xml:space="preserve"> </w:t>
-      </w:r>
-      <w:r>
-        <w:t xml:space="preserve">and manipulate said project. </w:t>
-      </w:r>
-    </w:p>
-    <w:p>
-      <w:pPr>
-        <w:pStyle w:val="Heading1"/>
-        <w:rPr>
-          <w:sz w:val="32"/>
-          <w:szCs w:val="32"/>
-          <w:lang w:val="de-DE"/>
-        </w:rPr>
-      </w:pPr>
-      <w:bookmarkStart w:id="10" w:name="_Toc200016748"/>
-      <w:r>
-        <w:rPr>
-          <w:sz w:val="32"/>
-          <w:szCs w:val="32"/>
-          <w:lang w:val="de-DE"/>
-        </w:rPr>
-        <w:t xml:space="preserve">Ignition </w:t>
-      </w:r>
-      <w:r>
-        <w:rPr>
-          <w:sz w:val="32"/>
-          <w:szCs w:val="32"/>
-          <w:lang w:val="de-DE"/>
-        </w:rPr>
-        <w:t>Tags</w:t>
-      </w:r>
-      <w:bookmarkEnd w:id="10"/>
+        <w:t>After selecting open you should now see that the tag browser has filled with all the tags included in the Human Machine Interface.</w:t>
+      </w:r>
     </w:p>
     <w:p>
       <w:pPr>
         <w:pStyle w:val="Heading2"/>
-        <w:rPr>
-          <w:sz w:val="28"/>
-          <w:szCs w:val="28"/>
-          <w:lang w:val="de-DE"/>
-        </w:rPr>
-      </w:pPr>
-      <w:bookmarkStart w:id="11" w:name="_Toc200016749"/>
-      <w:r>
-        <w:rPr>
-          <w:sz w:val="28"/>
-          <w:szCs w:val="28"/>
-          <w:lang w:val="de-DE"/>
-        </w:rPr>
-        <w:t>Description</w:t>
-      </w:r>
-      <w:bookmarkEnd w:id="11"/>
-    </w:p>
-    <w:p>
-      <w:r>
-        <w:t xml:space="preserve">Tags are points of </w:t>
-      </w:r>
-      <w:r>
-        <w:t xml:space="preserve">data that are statically or dynamically changed. Tags can be pulled from expressions, databases, or through Open Platform Communications (OPC) addresses. In our case tags are pulled from our OpenPLC </w:t>
-      </w:r>
-      <w:r>
-        <w:t>Modbus</w:t>
-      </w:r>
-      <w:r>
-        <w:t xml:space="preserve"> device that is </w:t>
-      </w:r>
-      <w:r>
-        <w:t>connected to Ignition’s default OPC Unified Architecture (UA) server.</w:t>
-      </w:r>
-    </w:p>
-    <w:p>
-      <w:pPr>
-        <w:pStyle w:val="Heading2"/>
-        <w:rPr>
-          <w:sz w:val="28"/>
-          <w:szCs w:val="28"/>
-        </w:rPr>
-      </w:pPr>
-      <w:bookmarkStart w:id="12" w:name="_Toc200016750"/>
-      <w:r>
-        <w:rPr>
-          <w:sz w:val="28"/>
-          <w:szCs w:val="28"/>
-        </w:rPr>
-        <w:t>HMI Tags</w:t>
-      </w:r>
-      <w:bookmarkEnd w:id="12"/>
-    </w:p>
-    <w:p>
-      <w:r>
-        <w:t xml:space="preserve">Although our model has dozens of tags defined in </w:t>
-      </w:r>
-      <w:r>
-        <w:t>its</w:t>
-      </w:r>
-      <w:r>
-        <w:t xml:space="preserve"> OpenPLC program, our HMI only needs access to tags that directly influence the </w:t>
-      </w:r>
-      <w:r>
-        <w:t>operators’</w:t>
-      </w:r>
-      <w:r>
-        <w:t xml:space="preserve"> control over the model’s systems. For this </w:t>
-      </w:r>
-      <w:r>
-        <w:t>reason,</w:t>
-      </w:r>
-      <w:r>
-        <w:t xml:space="preserve"> our HMI only has fourteen tags, each of these tags corresponds to a</w:t>
-      </w:r>
-      <w:r>
-        <w:t>t least one visual element in our HMI. Now we will go over each tag, what they represent, and what visual element they correspond to.</w:t>
-      </w:r>
-    </w:p>
-    <w:p/>
-    <w:p>
-      <w:pPr>
-        <w:pStyle w:val="Heading3"/>
-      </w:pPr>
-      <w:bookmarkStart w:id="13" w:name="_Toc200016751"/>
-      <w:r>
-        <w:lastRenderedPageBreak/>
-        <w:t>dv</w:t>
-      </w:r>
-      <w:bookmarkEnd w:id="13"/>
-    </w:p>
-    <w:p>
-      <w:r>
-        <w:t xml:space="preserve">This tag represents the status of the diverter valve, if the value is set to 0, the valve is set to siphon sugar, if the value is set to 1, the valve is set to siphon flour. </w:t>
-      </w:r>
-    </w:p>
-    <w:p>
-      <w:pPr>
-        <w:pStyle w:val="Heading3"/>
-      </w:pPr>
-      <w:bookmarkStart w:id="14" w:name="_Toc200016752"/>
-      <w:r>
-        <w:t>flour_alarm</w:t>
-      </w:r>
-      <w:bookmarkEnd w:id="14"/>
-    </w:p>
-    <w:p>
-      <w:r>
-        <w:t>This tag represents the status of the flour alarm, if the value is set to 0, then the flour_weight tag has a value greater than 1000, if the value is set to 1, then the flour_weight tag has a value less than 1000.</w:t>
-      </w:r>
-    </w:p>
-    <w:p>
-      <w:pPr>
-        <w:pStyle w:val="Heading3"/>
-      </w:pPr>
-      <w:bookmarkStart w:id="15" w:name="_Toc200016753"/>
-      <w:r>
-        <w:t>flour_</w:t>
-      </w:r>
-      <w:r>
-        <w:t>weight</w:t>
-      </w:r>
-      <w:bookmarkEnd w:id="15"/>
-    </w:p>
-    <w:p>
-      <w:r>
-        <w:t xml:space="preserve">This tag represents the total weight of the material in the flour silo. </w:t>
-      </w:r>
-    </w:p>
-    <w:p>
-      <w:pPr>
-        <w:pStyle w:val="Heading3"/>
-      </w:pPr>
-      <w:bookmarkStart w:id="16" w:name="_Toc200016754"/>
-      <w:r>
-        <w:t>hopper_alarm</w:t>
-      </w:r>
-      <w:bookmarkEnd w:id="16"/>
-    </w:p>
-    <w:p>
-      <w:r>
-        <w:t xml:space="preserve">This tag represents the status of the hopper alarm, if the value is set to 0, then the hopper_weight tag has a value greater than 100, if the value is set to 1, then the hopper_weight tag has a value less than 100. </w:t>
-      </w:r>
-    </w:p>
-    <w:p>
-      <w:pPr>
-        <w:pStyle w:val="Heading3"/>
-      </w:pPr>
-      <w:bookmarkStart w:id="17" w:name="_Toc200016755"/>
-      <w:r>
-        <w:t>hopper_weight</w:t>
-      </w:r>
-      <w:bookmarkEnd w:id="17"/>
-    </w:p>
-    <w:p>
-      <w:r>
-        <w:t>This tag represents the total weight of the material in the hopper</w:t>
-      </w:r>
-    </w:p>
-    <w:p>
-      <w:pPr>
-        <w:pStyle w:val="Heading3"/>
-      </w:pPr>
-      <w:bookmarkStart w:id="18" w:name="_Toc200016756"/>
-      <w:r>
-        <w:t>rv_1</w:t>
-      </w:r>
-      <w:bookmarkEnd w:id="18"/>
-    </w:p>
-    <w:p>
-      <w:r>
-        <w:t>This tag represents the rotary valve that controls the input of flour into the pneumatic conveying system. The rotary valve is open and spinning if the value of rv_1 is 1. The rotary valve is closed and not spinning if the value of rv_1 is 0.</w:t>
-      </w:r>
-    </w:p>
-    <w:p>
-      <w:pPr>
-        <w:pStyle w:val="Heading3"/>
-      </w:pPr>
-      <w:bookmarkStart w:id="19" w:name="_Toc200016757"/>
-      <w:r>
-        <w:t>rv_</w:t>
-      </w:r>
-      <w:r>
-        <w:t>2</w:t>
-      </w:r>
-      <w:bookmarkEnd w:id="19"/>
-    </w:p>
-    <w:p>
-      <w:r>
-        <w:t xml:space="preserve">This tag represents the rotary valve that controls the input of sugar into the pneumatic conveying system. The rotary valve is open and spinning if the value of rv_2 is 1. The rotary valve is closed and not spinning if the value of rv_2 is 0. </w:t>
-      </w:r>
-    </w:p>
-    <w:p>
-      <w:pPr>
-        <w:pStyle w:val="Heading3"/>
-      </w:pPr>
-      <w:bookmarkStart w:id="20" w:name="_Toc200016758"/>
-      <w:r>
-        <w:t>rv_</w:t>
-      </w:r>
-      <w:r>
-        <w:t>3</w:t>
-      </w:r>
-      <w:bookmarkEnd w:id="20"/>
-    </w:p>
-    <w:p>
-      <w:r>
-        <w:t xml:space="preserve">This tag represents the rotary valve that controls the </w:t>
-      </w:r>
-      <w:r>
-        <w:t xml:space="preserve">output of material from the hopper into the mixer. </w:t>
-      </w:r>
-      <w:r>
-        <w:t xml:space="preserve"> The rotary valve is open and spinning if the value of rv_</w:t>
-      </w:r>
-      <w:r>
-        <w:t>3</w:t>
-      </w:r>
-      <w:r>
-        <w:t xml:space="preserve"> is 1. The rotary valve is closed and not spinning </w:t>
-      </w:r>
-      <w:r>
-        <w:t>if</w:t>
-      </w:r>
-      <w:r>
-        <w:t xml:space="preserve"> the value of rv_</w:t>
-      </w:r>
-      <w:r>
-        <w:t>3</w:t>
-      </w:r>
-      <w:r>
-        <w:t xml:space="preserve"> is 0.</w:t>
-      </w:r>
-    </w:p>
-    <w:p>
-      <w:pPr>
-        <w:pStyle w:val="Heading3"/>
-      </w:pPr>
-      <w:bookmarkStart w:id="21" w:name="_Toc200016759"/>
-      <w:r>
-        <w:lastRenderedPageBreak/>
-        <w:t>sugar</w:t>
-      </w:r>
-      <w:r>
-        <w:t>_alarm</w:t>
-      </w:r>
-      <w:bookmarkEnd w:id="21"/>
-    </w:p>
-    <w:p>
-      <w:r>
-        <w:t xml:space="preserve">This tag represents the status of the </w:t>
-      </w:r>
-      <w:r>
-        <w:t>sugar</w:t>
-      </w:r>
-      <w:r>
-        <w:t xml:space="preserve"> alarm, if the value is set to 0, then the </w:t>
-      </w:r>
-      <w:r>
-        <w:t>sugar</w:t>
-      </w:r>
-      <w:r>
-        <w:t xml:space="preserve">_weight tag has a value greater than 1000, if the value is set to 1, then the </w:t>
-      </w:r>
-      <w:r>
-        <w:t>sugar</w:t>
-      </w:r>
-      <w:r>
-        <w:t>_weight tag has a value less than 1000.</w:t>
-      </w:r>
-    </w:p>
-    <w:p>
-      <w:pPr>
-        <w:pStyle w:val="Heading3"/>
-      </w:pPr>
-      <w:bookmarkStart w:id="22" w:name="_Toc200016760"/>
-      <w:r>
-        <w:t>sugar</w:t>
-      </w:r>
-      <w:r>
-        <w:t>_weight</w:t>
-      </w:r>
-      <w:bookmarkEnd w:id="22"/>
-    </w:p>
-    <w:p>
-      <w:r>
-        <w:t xml:space="preserve">This tag represents the total weight of the material in the </w:t>
-      </w:r>
-      <w:r>
-        <w:t>sugar</w:t>
-      </w:r>
-      <w:r>
-        <w:t xml:space="preserve"> silo.</w:t>
-      </w:r>
-    </w:p>
-    <w:p>
-      <w:pPr>
-        <w:pStyle w:val="Heading3"/>
-      </w:pPr>
-      <w:bookmarkStart w:id="23" w:name="_Toc200016761"/>
-      <w:r>
-        <w:t>vacuum</w:t>
-      </w:r>
-      <w:bookmarkEnd w:id="23"/>
-    </w:p>
-    <w:p>
-      <w:r>
-        <w:t>This tag represents the on/off state of the vacuum for the pneumatic conveying system. If the value is 1, then the pneumatic conveying system will move material. If the value is 0, then the pneumatic conveying system will not move material.</w:t>
-      </w:r>
-    </w:p>
-    <w:p>
-      <w:pPr>
-        <w:pStyle w:val="Heading3"/>
-      </w:pPr>
-      <w:bookmarkStart w:id="24" w:name="_Toc200016762"/>
-      <w:r>
-        <w:t>v</w:t>
-      </w:r>
-      <w:r>
-        <w:t>acuum</w:t>
-      </w:r>
-      <w:r>
-        <w:t>_alarm</w:t>
-      </w:r>
-      <w:bookmarkEnd w:id="24"/>
-    </w:p>
-    <w:p>
-      <w:r>
-        <w:t>This tag represents the status of the vacuum alarm. If the value is set to 0, then the vacuum is performing at a reasonable speed for the material being conveyed. If the value is set to 1, then the vacuum is underperforming in speed for the material being conveyed leading to saltation.</w:t>
-      </w:r>
-    </w:p>
-    <w:p>
-      <w:pPr>
-        <w:pStyle w:val="Heading3"/>
-      </w:pPr>
-      <w:bookmarkStart w:id="25" w:name="_Toc200016763"/>
-      <w:r>
-        <w:t>vacuum_</w:t>
-      </w:r>
-      <w:r>
-        <w:t>freq</w:t>
-      </w:r>
-      <w:bookmarkEnd w:id="25"/>
-    </w:p>
-    <w:p>
-      <w:r>
-        <w:t xml:space="preserve">This tag represents the </w:t>
-      </w:r>
-      <w:r>
-        <w:t xml:space="preserve">frequency of the vacuum’s motor. The higher the frequency the higher the RPM and vice versa. </w:t>
-      </w:r>
-    </w:p>
-    <w:p>
-      <w:pPr>
-        <w:pStyle w:val="Heading3"/>
-      </w:pPr>
-      <w:bookmarkStart w:id="26" w:name="_Toc200016764"/>
-      <w:r>
-        <w:t>vacuum_</w:t>
-      </w:r>
-      <w:r>
-        <w:t>manual</w:t>
-      </w:r>
-      <w:bookmarkEnd w:id="26"/>
-    </w:p>
-    <w:p>
-      <w:r>
-        <w:t>This tag represents the state of the frequency control for the vacuum. If the value is set to 0, then the vacuum is set to an automatic frequency based on the material being conveyed. If the value is set to 1, then the vacuum’s frequency can be manipulated by the operator.</w:t>
-      </w:r>
-    </w:p>
-    <w:p>
-      <w:pPr>
-        <w:pStyle w:val="Heading3"/>
-      </w:pPr>
-      <w:bookmarkStart w:id="27" w:name="_Toc200016765"/>
-      <w:r>
-        <w:t>vacuum_</w:t>
-      </w:r>
-      <w:r>
-        <w:t>rpm</w:t>
-      </w:r>
-      <w:bookmarkEnd w:id="27"/>
-    </w:p>
-    <w:p>
-      <w:r>
-        <w:t>This tag represents the rpm of the vacuum’s motor. The higher the rpm, the faster material is conveyed.</w:t>
-      </w:r>
-    </w:p>
-    <w:p/>
-    <w:p>
-      <w:r>
-        <w:t>The location of all visual elements and their relevant tags can be seen below.</w:t>
-      </w:r>
-    </w:p>
-    <w:p/>
-    <w:p/>
-    <w:p/>
-    <w:p/>
-    <w:p/>
-    <w:p/>
-    <w:p/>
-    <w:p/>
-    <w:p/>
-    <w:p>
-      <w:r>
-        <w:rPr>
-          <w:noProof/>
-        </w:rPr>
+      </w:pPr>
+      <w:r>
+        <w:t>All About the Designer</w:t>
+      </w:r>
+    </w:p>
+    <w:p>
+      <w:r>
+        <w:t xml:space="preserve">After opening </w:t>
+      </w:r>
+      <w:r>
+        <w:t xml:space="preserve">the designer and </w:t>
+      </w:r>
+      <w:r>
+        <w:t xml:space="preserve">you </w:t>
+      </w:r>
+      <w:r>
+        <w:t>should see the following</w:t>
+      </w:r>
+      <w:r>
+        <w:t>:</w:t>
+      </w:r>
+    </w:p>
+    <w:p>
+      <w:r>
         <w:drawing>
-          <wp:inline distT="0" distB="0" distL="0" distR="0" wp14:anchorId="0C02F43B" wp14:editId="6D8B871F">
-            <wp:extent cx="5897190" cy="4679950"/>
-            <wp:effectExtent l="0" t="0" r="8890" b="6350"/>
-            <wp:docPr id="1542826072" name="Picture 2"/>
+          <wp:inline distT="0" distB="0" distL="0" distR="0" wp14:anchorId="4A64B965" wp14:editId="08000153">
+            <wp:extent cx="5943600" cy="2987675"/>
+            <wp:effectExtent l="0" t="0" r="0" b="3175"/>
+            <wp:docPr id="53333876" name="Picture 1"/>
             <wp:cNvGraphicFramePr>
               <a:graphicFrameLocks xmlns:a="http://schemas.openxmlformats.org/drawingml/2006/main" noChangeAspect="1"/>
             </wp:cNvGraphicFramePr>
@@ -3777,13 +3355,809 @@
               <a:graphicData uri="http://schemas.openxmlformats.org/drawingml/2006/picture">
                 <pic:pic xmlns:pic="http://schemas.openxmlformats.org/drawingml/2006/picture">
                   <pic:nvPicPr>
-                    <pic:cNvPr id="0" name="Picture 3"/>
+                    <pic:cNvPr id="53333876" name=""/>
+                    <pic:cNvPicPr/>
+                  </pic:nvPicPr>
+                  <pic:blipFill>
+                    <a:blip r:embed="rId38"/>
+                    <a:stretch>
+                      <a:fillRect/>
+                    </a:stretch>
+                  </pic:blipFill>
+                  <pic:spPr>
+                    <a:xfrm>
+                      <a:off x="0" y="0"/>
+                      <a:ext cx="5943600" cy="2987675"/>
+                    </a:xfrm>
+                    <a:prstGeom prst="rect">
+                      <a:avLst/>
+                    </a:prstGeom>
+                  </pic:spPr>
+                </pic:pic>
+              </a:graphicData>
+            </a:graphic>
+          </wp:inline>
+        </w:drawing>
+      </w:r>
+    </w:p>
+    <w:p>
+      <w:r>
+        <w:lastRenderedPageBreak/>
+        <w:t xml:space="preserve">If you see any errors, such as “Trial Expired” or the tag values in red font, be sure to reset your trial in the ignition gateway or ensure you are connected to the OpenPLC runtime instance. </w:t>
+      </w:r>
+    </w:p>
+    <w:p>
+      <w:r>
+        <w:t xml:space="preserve">There are </w:t>
+      </w:r>
+      <w:r>
+        <w:t>four</w:t>
+      </w:r>
+      <w:r>
+        <w:t xml:space="preserve"> main windows in Ignition Designer that you should direct your attention to. First there is the </w:t>
+      </w:r>
+      <w:r>
+        <w:t>“Project</w:t>
+      </w:r>
+      <w:r>
+        <w:t xml:space="preserve"> </w:t>
+      </w:r>
+      <w:r>
+        <w:t>Browser”</w:t>
+      </w:r>
+      <w:r>
+        <w:t xml:space="preserve"> which shows all project components from scripts to visual elements</w:t>
+      </w:r>
+      <w:r>
+        <w:t>, alarms, reports, and database queries</w:t>
+      </w:r>
+      <w:r>
+        <w:t xml:space="preserve">. </w:t>
+      </w:r>
+    </w:p>
+    <w:p>
+      <w:r>
+        <w:drawing>
+          <wp:inline distT="0" distB="0" distL="0" distR="0" wp14:anchorId="594ACDA1" wp14:editId="79BD03FE">
+            <wp:extent cx="2250219" cy="3318817"/>
+            <wp:effectExtent l="0" t="0" r="0" b="0"/>
+            <wp:docPr id="670804847" name="Picture 1"/>
+            <wp:cNvGraphicFramePr>
+              <a:graphicFrameLocks xmlns:a="http://schemas.openxmlformats.org/drawingml/2006/main" noChangeAspect="1"/>
+            </wp:cNvGraphicFramePr>
+            <a:graphic xmlns:a="http://schemas.openxmlformats.org/drawingml/2006/main">
+              <a:graphicData uri="http://schemas.openxmlformats.org/drawingml/2006/picture">
+                <pic:pic xmlns:pic="http://schemas.openxmlformats.org/drawingml/2006/picture">
+                  <pic:nvPicPr>
+                    <pic:cNvPr id="670804847" name=""/>
+                    <pic:cNvPicPr/>
+                  </pic:nvPicPr>
+                  <pic:blipFill>
+                    <a:blip r:embed="rId39"/>
+                    <a:stretch>
+                      <a:fillRect/>
+                    </a:stretch>
+                  </pic:blipFill>
+                  <pic:spPr>
+                    <a:xfrm>
+                      <a:off x="0" y="0"/>
+                      <a:ext cx="2257130" cy="3329010"/>
+                    </a:xfrm>
+                    <a:prstGeom prst="rect">
+                      <a:avLst/>
+                    </a:prstGeom>
+                  </pic:spPr>
+                </pic:pic>
+              </a:graphicData>
+            </a:graphic>
+          </wp:inline>
+        </w:drawing>
+      </w:r>
+    </w:p>
+    <w:p>
+      <w:r>
+        <w:t xml:space="preserve">Next is the “Tag Browser” where you can see all the tags included in the HMI, these numbers will change as the python simulation runs in accordance with an operator’s inputs into the HMI. </w:t>
+      </w:r>
+    </w:p>
+    <w:p>
+      <w:r>
+        <w:lastRenderedPageBreak/>
+        <w:drawing>
+          <wp:inline distT="0" distB="0" distL="0" distR="0" wp14:anchorId="26420DA4" wp14:editId="4F121B2D">
+            <wp:extent cx="4105848" cy="3543795"/>
+            <wp:effectExtent l="0" t="0" r="0" b="0"/>
+            <wp:docPr id="405783398" name="Picture 1"/>
+            <wp:cNvGraphicFramePr>
+              <a:graphicFrameLocks xmlns:a="http://schemas.openxmlformats.org/drawingml/2006/main" noChangeAspect="1"/>
+            </wp:cNvGraphicFramePr>
+            <a:graphic xmlns:a="http://schemas.openxmlformats.org/drawingml/2006/main">
+              <a:graphicData uri="http://schemas.openxmlformats.org/drawingml/2006/picture">
+                <pic:pic xmlns:pic="http://schemas.openxmlformats.org/drawingml/2006/picture">
+                  <pic:nvPicPr>
+                    <pic:cNvPr id="405783398" name=""/>
+                    <pic:cNvPicPr/>
+                  </pic:nvPicPr>
+                  <pic:blipFill>
+                    <a:blip r:embed="rId40"/>
+                    <a:stretch>
+                      <a:fillRect/>
+                    </a:stretch>
+                  </pic:blipFill>
+                  <pic:spPr>
+                    <a:xfrm>
+                      <a:off x="0" y="0"/>
+                      <a:ext cx="4105848" cy="3543795"/>
+                    </a:xfrm>
+                    <a:prstGeom prst="rect">
+                      <a:avLst/>
+                    </a:prstGeom>
+                  </pic:spPr>
+                </pic:pic>
+              </a:graphicData>
+            </a:graphic>
+          </wp:inline>
+        </w:drawing>
+      </w:r>
+    </w:p>
+    <w:p>
+      <w:r>
+        <w:t>Next</w:t>
+      </w:r>
+      <w:r>
+        <w:t xml:space="preserve">, you have the main window which will show you the HMI in </w:t>
+      </w:r>
+      <w:proofErr w:type="spellStart"/>
+      <w:proofErr w:type="gramStart"/>
+      <w:r>
+        <w:t>it’s</w:t>
+      </w:r>
+      <w:proofErr w:type="spellEnd"/>
+      <w:proofErr w:type="gramEnd"/>
+      <w:r>
+        <w:t xml:space="preserve"> current state</w:t>
+      </w:r>
+      <w:r>
+        <w:t>. The main window can be used to show you three separate views; “</w:t>
+      </w:r>
+      <w:proofErr w:type="spellStart"/>
+      <w:r>
+        <w:t>FinishedGood</w:t>
+      </w:r>
+      <w:proofErr w:type="spellEnd"/>
+      <w:r>
+        <w:t>,” “Resource Allocation,” and “</w:t>
+      </w:r>
+      <w:proofErr w:type="spellStart"/>
+      <w:r>
+        <w:t>ProductionArea</w:t>
+      </w:r>
+      <w:proofErr w:type="spellEnd"/>
+      <w:r>
+        <w:t xml:space="preserve">.” </w:t>
+      </w:r>
+      <w:proofErr w:type="gramStart"/>
+      <w:r>
+        <w:t>Most</w:t>
+      </w:r>
+      <w:proofErr w:type="gramEnd"/>
+      <w:r>
+        <w:t xml:space="preserve"> components in each view are tied to a specific tag, we’ll explain what each tag does and what component they are tied to</w:t>
+      </w:r>
+      <w:r>
+        <w:t xml:space="preserve">. The tag values will change in accordance with the HMI and these changes will also be reflected in </w:t>
+      </w:r>
+      <w:proofErr w:type="spellStart"/>
+      <w:r>
+        <w:t>OpenPLC’s</w:t>
+      </w:r>
+      <w:proofErr w:type="spellEnd"/>
+      <w:r>
+        <w:t xml:space="preserve"> monitor. </w:t>
+      </w:r>
+    </w:p>
+    <w:p>
+      <w:r>
+        <w:drawing>
+          <wp:inline distT="0" distB="0" distL="0" distR="0" wp14:anchorId="53F54E71" wp14:editId="02CD27E8">
+            <wp:extent cx="3393728" cy="2496710"/>
+            <wp:effectExtent l="0" t="0" r="0" b="0"/>
+            <wp:docPr id="2033658709" name="Picture 1"/>
+            <wp:cNvGraphicFramePr>
+              <a:graphicFrameLocks xmlns:a="http://schemas.openxmlformats.org/drawingml/2006/main" noChangeAspect="1"/>
+            </wp:cNvGraphicFramePr>
+            <a:graphic xmlns:a="http://schemas.openxmlformats.org/drawingml/2006/main">
+              <a:graphicData uri="http://schemas.openxmlformats.org/drawingml/2006/picture">
+                <pic:pic xmlns:pic="http://schemas.openxmlformats.org/drawingml/2006/picture">
+                  <pic:nvPicPr>
+                    <pic:cNvPr id="2033658709" name=""/>
+                    <pic:cNvPicPr/>
+                  </pic:nvPicPr>
+                  <pic:blipFill>
+                    <a:blip r:embed="rId41"/>
+                    <a:stretch>
+                      <a:fillRect/>
+                    </a:stretch>
+                  </pic:blipFill>
+                  <pic:spPr>
+                    <a:xfrm>
+                      <a:off x="0" y="0"/>
+                      <a:ext cx="3403726" cy="2504066"/>
+                    </a:xfrm>
+                    <a:prstGeom prst="rect">
+                      <a:avLst/>
+                    </a:prstGeom>
+                  </pic:spPr>
+                </pic:pic>
+              </a:graphicData>
+            </a:graphic>
+          </wp:inline>
+        </w:drawing>
+      </w:r>
+    </w:p>
+    <w:p>
+      <w:r>
+        <w:lastRenderedPageBreak/>
+        <w:t xml:space="preserve">To manipulate these values, we first must enable read/write mode and then preview mode. This will allow us to click </w:t>
+      </w:r>
+      <w:r>
+        <w:t>different components and change the values accordingly</w:t>
+      </w:r>
+      <w:r>
+        <w:t>.</w:t>
+      </w:r>
+    </w:p>
+    <w:p>
+      <w:r>
+        <w:drawing>
+          <wp:inline distT="0" distB="0" distL="0" distR="0" wp14:anchorId="492A6DF9" wp14:editId="7A385072">
+            <wp:extent cx="5943600" cy="347345"/>
+            <wp:effectExtent l="0" t="0" r="0" b="0"/>
+            <wp:docPr id="591084228" name="Picture 1"/>
+            <wp:cNvGraphicFramePr>
+              <a:graphicFrameLocks xmlns:a="http://schemas.openxmlformats.org/drawingml/2006/main" noChangeAspect="1"/>
+            </wp:cNvGraphicFramePr>
+            <a:graphic xmlns:a="http://schemas.openxmlformats.org/drawingml/2006/main">
+              <a:graphicData uri="http://schemas.openxmlformats.org/drawingml/2006/picture">
+                <pic:pic xmlns:pic="http://schemas.openxmlformats.org/drawingml/2006/picture">
+                  <pic:nvPicPr>
+                    <pic:cNvPr id="591084228" name=""/>
+                    <pic:cNvPicPr/>
+                  </pic:nvPicPr>
+                  <pic:blipFill>
+                    <a:blip r:embed="rId42"/>
+                    <a:stretch>
+                      <a:fillRect/>
+                    </a:stretch>
+                  </pic:blipFill>
+                  <pic:spPr>
+                    <a:xfrm>
+                      <a:off x="0" y="0"/>
+                      <a:ext cx="5943600" cy="347345"/>
+                    </a:xfrm>
+                    <a:prstGeom prst="rect">
+                      <a:avLst/>
+                    </a:prstGeom>
+                  </pic:spPr>
+                </pic:pic>
+              </a:graphicData>
+            </a:graphic>
+          </wp:inline>
+        </w:drawing>
+      </w:r>
+    </w:p>
+    <w:p>
+      <w:r>
+        <w:t xml:space="preserve">Congratulations! </w:t>
+      </w:r>
+      <w:r>
+        <w:t xml:space="preserve">Now you should </w:t>
+      </w:r>
+      <w:r>
+        <w:t>understand</w:t>
+      </w:r>
+      <w:r>
+        <w:t xml:space="preserve"> how to load a project into Ignition Designer</w:t>
+      </w:r>
+      <w:r>
+        <w:t xml:space="preserve"> </w:t>
+      </w:r>
+      <w:r>
+        <w:t xml:space="preserve">and manipulate said project. </w:t>
+      </w:r>
+    </w:p>
+    <w:p>
+      <w:pPr>
+        <w:pStyle w:val="Heading1"/>
+        <w:rPr>
+          <w:sz w:val="32"/>
+          <w:szCs w:val="32"/>
+          <w:lang w:val="de-DE"/>
+        </w:rPr>
+      </w:pPr>
+      <w:bookmarkStart w:id="10" w:name="_Toc200016748"/>
+      <w:r>
+        <w:rPr>
+          <w:sz w:val="32"/>
+          <w:szCs w:val="32"/>
+          <w:lang w:val="de-DE"/>
+        </w:rPr>
+        <w:t>Ignition Tags</w:t>
+      </w:r>
+      <w:bookmarkEnd w:id="10"/>
+    </w:p>
+    <w:p>
+      <w:pPr>
+        <w:pStyle w:val="Heading2"/>
+        <w:rPr>
+          <w:sz w:val="28"/>
+          <w:szCs w:val="28"/>
+          <w:lang w:val="de-DE"/>
+        </w:rPr>
+      </w:pPr>
+      <w:bookmarkStart w:id="11" w:name="_Toc200016749"/>
+      <w:r>
+        <w:rPr>
+          <w:sz w:val="28"/>
+          <w:szCs w:val="28"/>
+          <w:lang w:val="de-DE"/>
+        </w:rPr>
+        <w:t>Description</w:t>
+      </w:r>
+      <w:bookmarkEnd w:id="11"/>
+    </w:p>
+    <w:p>
+      <w:r>
+        <w:t xml:space="preserve">Tags are points of </w:t>
+      </w:r>
+      <w:r>
+        <w:t xml:space="preserve">data that are statically or dynamically changed. Tags can be pulled from expressions, databases, or through Open Platform Communications (OPC) addresses. In our case tags are pulled from our OpenPLC </w:t>
+      </w:r>
+      <w:r>
+        <w:t>Modbus</w:t>
+      </w:r>
+      <w:r>
+        <w:t xml:space="preserve"> device that is </w:t>
+      </w:r>
+      <w:r>
+        <w:t>connected to Ignition’s default OPC Unified Architecture (UA) server.</w:t>
+      </w:r>
+    </w:p>
+    <w:p>
+      <w:pPr>
+        <w:pStyle w:val="Heading2"/>
+        <w:rPr>
+          <w:sz w:val="28"/>
+          <w:szCs w:val="28"/>
+        </w:rPr>
+      </w:pPr>
+      <w:bookmarkStart w:id="12" w:name="_Toc200016750"/>
+      <w:r>
+        <w:rPr>
+          <w:sz w:val="28"/>
+          <w:szCs w:val="28"/>
+        </w:rPr>
+        <w:t>HMI Tags</w:t>
+      </w:r>
+      <w:bookmarkEnd w:id="12"/>
+    </w:p>
+    <w:p>
+      <w:r>
+        <w:t xml:space="preserve">Although our model has dozens of tags defined in </w:t>
+      </w:r>
+      <w:r>
+        <w:t>its</w:t>
+      </w:r>
+      <w:r>
+        <w:t xml:space="preserve"> OpenPLC program, our HMI only needs access to tags that directly influence the </w:t>
+      </w:r>
+      <w:r>
+        <w:t>operators’</w:t>
+      </w:r>
+      <w:r>
+        <w:t xml:space="preserve"> control over the model’s systems. For this </w:t>
+      </w:r>
+      <w:r>
+        <w:t>reason,</w:t>
+      </w:r>
+      <w:r>
+        <w:t xml:space="preserve"> our HMI has </w:t>
+      </w:r>
+      <w:r>
+        <w:t>~65</w:t>
+      </w:r>
+      <w:r>
+        <w:t xml:space="preserve"> tags, each of these tags corresponds to a</w:t>
+      </w:r>
+      <w:r>
+        <w:t>t least one visual element in our HMI. Now we will go over each tag, what they represent, and what visual element they correspond to.</w:t>
+      </w:r>
+      <w:r>
+        <w:t xml:space="preserve"> Some tags are not </w:t>
+      </w:r>
+      <w:proofErr w:type="gramStart"/>
+      <w:r>
+        <w:t>implemented,</w:t>
+      </w:r>
+      <w:proofErr w:type="gramEnd"/>
+      <w:r>
+        <w:t xml:space="preserve"> these tags are </w:t>
+      </w:r>
+      <w:r>
+        <w:rPr>
+          <w:highlight w:val="yellow"/>
+        </w:rPr>
+        <w:t>highlighted</w:t>
+      </w:r>
+      <w:r>
+        <w:t>.</w:t>
+      </w:r>
+    </w:p>
+    <w:p/>
+    <w:p>
+      <w:pPr>
+        <w:pStyle w:val="Heading3"/>
+      </w:pPr>
+      <w:bookmarkStart w:id="13" w:name="_Toc200016751"/>
+      <w:r>
+        <w:t>dv</w:t>
+      </w:r>
+      <w:bookmarkEnd w:id="13"/>
+    </w:p>
+    <w:p>
+      <w:r>
+        <w:t xml:space="preserve">This tag represents the status of the diverter valve, if the value is set to 0, the valve is set to siphon sugar, if the value is set to 1, the valve is set to siphon flour. </w:t>
+      </w:r>
+    </w:p>
+    <w:p>
+      <w:pPr>
+        <w:pStyle w:val="Heading3"/>
+      </w:pPr>
+      <w:bookmarkStart w:id="14" w:name="_Toc200016752"/>
+      <w:r>
+        <w:rPr>
+          <w:highlight w:val="yellow"/>
+        </w:rPr>
+        <w:t>flour_alarm</w:t>
+      </w:r>
+      <w:bookmarkEnd w:id="14"/>
+    </w:p>
+    <w:p>
+      <w:r>
+        <w:t>This tag represents the status of the flour alarm, if the value is set to 0, then the flour_weight tag has a value greater than 1000, if the value is set to 1, then the flour_weight tag has a value less than 1000.</w:t>
+      </w:r>
+    </w:p>
+    <w:p>
+      <w:pPr>
+        <w:pStyle w:val="Heading3"/>
+      </w:pPr>
+      <w:bookmarkStart w:id="15" w:name="_Toc200016753"/>
+      <w:r>
+        <w:t>flour_</w:t>
+      </w:r>
+      <w:r>
+        <w:t>weight</w:t>
+      </w:r>
+      <w:bookmarkEnd w:id="15"/>
+    </w:p>
+    <w:p>
+      <w:r>
+        <w:t xml:space="preserve">This tag represents the total weight of the material in the flour silo. </w:t>
+      </w:r>
+    </w:p>
+    <w:p>
+      <w:pPr>
+        <w:pStyle w:val="Heading3"/>
+      </w:pPr>
+      <w:bookmarkStart w:id="16" w:name="_Toc200016754"/>
+      <w:r>
+        <w:rPr>
+          <w:highlight w:val="yellow"/>
+        </w:rPr>
+        <w:lastRenderedPageBreak/>
+        <w:t>hopper_alarm</w:t>
+      </w:r>
+      <w:bookmarkEnd w:id="16"/>
+    </w:p>
+    <w:p>
+      <w:r>
+        <w:t xml:space="preserve">This tag represents the status of the hopper alarm, if the value is set to 0, then the hopper_weight tag has a value greater than 100, if the value is set to 1, then the hopper_weight tag has a value less than 100. </w:t>
+      </w:r>
+    </w:p>
+    <w:p>
+      <w:pPr>
+        <w:pStyle w:val="Heading3"/>
+      </w:pPr>
+      <w:bookmarkStart w:id="17" w:name="_Toc200016755"/>
+      <w:r>
+        <w:t>hopper_weight</w:t>
+      </w:r>
+      <w:bookmarkEnd w:id="17"/>
+    </w:p>
+    <w:p>
+      <w:r>
+        <w:t>This tag represents the total weight of the material in the hopper</w:t>
+      </w:r>
+    </w:p>
+    <w:p>
+      <w:pPr>
+        <w:pStyle w:val="Heading3"/>
+      </w:pPr>
+      <w:bookmarkStart w:id="18" w:name="_Toc200016756"/>
+      <w:r>
+        <w:t>rv_1</w:t>
+      </w:r>
+      <w:bookmarkEnd w:id="18"/>
+    </w:p>
+    <w:p>
+      <w:r>
+        <w:t>This tag represents the rotary valve that controls the input of flour into the pneumatic conveying system. The rotary valve is open and spinning if the value of rv_1 is 1. The rotary valve is closed and not spinning if the value of rv_1 is 0.</w:t>
+      </w:r>
+    </w:p>
+    <w:p>
+      <w:pPr>
+        <w:pStyle w:val="Heading3"/>
+      </w:pPr>
+      <w:bookmarkStart w:id="19" w:name="_Toc200016757"/>
+      <w:r>
+        <w:t>rv_2</w:t>
+      </w:r>
+      <w:bookmarkEnd w:id="19"/>
+    </w:p>
+    <w:p>
+      <w:r>
+        <w:t xml:space="preserve">This tag represents the rotary valve that controls the input of sugar into the pneumatic conveying system. The rotary valve is open and spinning if the value of rv_2 is 1. The rotary valve is closed and not spinning if the value of rv_2 is 0. </w:t>
+      </w:r>
+    </w:p>
+    <w:p>
+      <w:pPr>
+        <w:pStyle w:val="Heading3"/>
+      </w:pPr>
+      <w:bookmarkStart w:id="20" w:name="_Toc200016758"/>
+      <w:r>
+        <w:t>rv_3</w:t>
+      </w:r>
+      <w:bookmarkEnd w:id="20"/>
+    </w:p>
+    <w:p>
+      <w:r>
+        <w:t>This tag represents the rotary valve that controls the output of material from the hopper into the mixer.  The rotary valve is open and spinning if the value of rv_3 is 1. The rotary valve is closed and not spinning if the value of rv_3 is 0.</w:t>
+      </w:r>
+    </w:p>
+    <w:p>
+      <w:pPr>
+        <w:pStyle w:val="Heading3"/>
+      </w:pPr>
+      <w:bookmarkStart w:id="21" w:name="_Toc200016759"/>
+      <w:r>
+        <w:rPr>
+          <w:highlight w:val="yellow"/>
+        </w:rPr>
+        <w:t>sugar_alarm</w:t>
+      </w:r>
+      <w:bookmarkEnd w:id="21"/>
+    </w:p>
+    <w:p>
+      <w:r>
+        <w:t>This tag represents the status of the sugar alarm, if the value is set to 0, then the sugar_weight tag has a value greater than 1000, if the value is set to 1, then the sugar_weight tag has a value less than 1000.</w:t>
+      </w:r>
+    </w:p>
+    <w:p>
+      <w:pPr>
+        <w:pStyle w:val="Heading3"/>
+      </w:pPr>
+      <w:bookmarkStart w:id="22" w:name="_Toc200016760"/>
+      <w:r>
+        <w:t>sugar</w:t>
+      </w:r>
+      <w:r>
+        <w:t>_weight</w:t>
+      </w:r>
+      <w:bookmarkEnd w:id="22"/>
+    </w:p>
+    <w:p>
+      <w:r>
+        <w:t>This tag represents the total weight of the material in the sugar silo.</w:t>
+      </w:r>
+    </w:p>
+    <w:p>
+      <w:pPr>
+        <w:pStyle w:val="Heading3"/>
+      </w:pPr>
+      <w:bookmarkStart w:id="23" w:name="_Toc200016761"/>
+      <w:r>
+        <w:t>vacuum</w:t>
+      </w:r>
+      <w:bookmarkEnd w:id="23"/>
+    </w:p>
+    <w:p>
+      <w:r>
+        <w:t>This tag represents the on/off state of the vacuum for the pneumatic conveying system. If the value is 1, then the pneumatic conveying system will move material. If the value is 0, then the pneumatic conveying system will not move material.</w:t>
+      </w:r>
+    </w:p>
+    <w:p>
+      <w:pPr>
+        <w:pStyle w:val="Heading3"/>
+      </w:pPr>
+      <w:bookmarkStart w:id="24" w:name="_Toc200016762"/>
+      <w:r>
+        <w:rPr>
+          <w:highlight w:val="yellow"/>
+        </w:rPr>
+        <w:lastRenderedPageBreak/>
+        <w:t>vacuum_alarm</w:t>
+      </w:r>
+      <w:bookmarkEnd w:id="24"/>
+    </w:p>
+    <w:p>
+      <w:r>
+        <w:t>This tag represents the status of the vacuum alarm. If the value is set to 0, then the vacuum is performing at a reasonable speed for the material being conveyed. If the value is set to 1, then the vacuum is underperforming in speed for the material being conveyed leading to saltation.</w:t>
+      </w:r>
+    </w:p>
+    <w:p>
+      <w:pPr>
+        <w:pStyle w:val="Heading3"/>
+      </w:pPr>
+      <w:bookmarkStart w:id="25" w:name="_Toc200016764"/>
+      <w:proofErr w:type="spellStart"/>
+      <w:r>
+        <w:t>vacuum_manual</w:t>
+      </w:r>
+      <w:bookmarkEnd w:id="25"/>
+      <w:proofErr w:type="spellEnd"/>
+    </w:p>
+    <w:p>
+      <w:r>
+        <w:t>This tag represents the state of the frequency control for the vacuum. If the value is set to 0, then the vacuum is set to an automatic frequency based on the material being conveyed. If the value is set to 1, then the vacuum’s frequency can be manipulated by the operator.</w:t>
+      </w:r>
+    </w:p>
+    <w:p>
+      <w:pPr>
+        <w:pStyle w:val="Heading3"/>
+      </w:pPr>
+      <w:bookmarkStart w:id="26" w:name="_Toc200016765"/>
+      <w:r>
+        <w:t>vacuum_rpm</w:t>
+      </w:r>
+      <w:bookmarkEnd w:id="26"/>
+    </w:p>
+    <w:p>
+      <w:r>
+        <w:t>This tag represents the rpm of the vacuum’s motor. The higher the rpm, the faster material is conveyed.</w:t>
+      </w:r>
+    </w:p>
+    <w:p>
+      <w:pPr>
+        <w:pStyle w:val="Heading3"/>
+      </w:pPr>
+      <w:proofErr w:type="spellStart"/>
+      <w:r>
+        <w:t>trough_transfer</w:t>
+      </w:r>
+      <w:proofErr w:type="spellEnd"/>
+    </w:p>
+    <w:p>
+      <w:r>
+        <w:t xml:space="preserve">This tag represents the transfer of raw material from the mixer to the </w:t>
+      </w:r>
+      <w:proofErr w:type="spellStart"/>
+      <w:r>
+        <w:t>wirecutter</w:t>
+      </w:r>
+      <w:proofErr w:type="spellEnd"/>
+      <w:r>
+        <w:t xml:space="preserve"> </w:t>
+      </w:r>
+      <w:proofErr w:type="gramStart"/>
+      <w:r>
+        <w:t>trough</w:t>
+      </w:r>
+      <w:proofErr w:type="gramEnd"/>
+    </w:p>
+    <w:p>
+      <w:pPr>
+        <w:pStyle w:val="Heading3"/>
+      </w:pPr>
+      <w:proofErr w:type="spellStart"/>
+      <w:r>
+        <w:t>add_ingredients</w:t>
+      </w:r>
+      <w:proofErr w:type="spellEnd"/>
+    </w:p>
+    <w:p>
+      <w:r>
+        <w:t xml:space="preserve">This tag when triggered adds the non-bulk ingredients to the mixer, whether it be chocolate chips, brown sugar, or some other ingredient besides flour and sugar. </w:t>
+      </w:r>
+    </w:p>
+    <w:p>
+      <w:pPr>
+        <w:pStyle w:val="Heading3"/>
+      </w:pPr>
+      <w:r>
+        <w:t>mixer</w:t>
+      </w:r>
+    </w:p>
+    <w:p>
+      <w:r>
+        <w:t>This tag represents whether the mixer is on or off, basically when it’s spinning or not spinning</w:t>
+      </w:r>
+    </w:p>
+    <w:p>
+      <w:pPr>
+        <w:pStyle w:val="Heading3"/>
+      </w:pPr>
+      <w:proofErr w:type="spellStart"/>
+      <w:r>
+        <w:t>mixer_rpm</w:t>
+      </w:r>
+      <w:proofErr w:type="spellEnd"/>
+    </w:p>
+    <w:p>
+      <w:r>
+        <w:t>This tag represents how fast the mixer is spinning and mixing the dough</w:t>
+      </w:r>
+    </w:p>
+    <w:p>
+      <w:pPr>
+        <w:pStyle w:val="Heading3"/>
+      </w:pPr>
+      <w:proofErr w:type="spellStart"/>
+      <w:r>
+        <w:t>mixer_weight</w:t>
+      </w:r>
+      <w:proofErr w:type="spellEnd"/>
+    </w:p>
+    <w:p>
+      <w:r>
+        <w:t>This tag represents how much dough is in the mixer; there can be a maximum of 60 pounds of dough in the mixer at one time.</w:t>
+      </w:r>
+    </w:p>
+    <w:p/>
+    <w:p/>
+    <w:p/>
+    <w:p>
+      <w:r>
+        <w:lastRenderedPageBreak/>
+        <w:t>The location of all visual elements and their relevant tags can be seen below</w:t>
+      </w:r>
+      <w:r>
+        <w:t xml:space="preserve"> for the “</w:t>
+      </w:r>
+      <w:proofErr w:type="spellStart"/>
+      <w:r>
+        <w:t>ResourceAllocation</w:t>
+      </w:r>
+      <w:proofErr w:type="spellEnd"/>
+      <w:r>
+        <w:t>” view</w:t>
+      </w:r>
+      <w:r>
+        <w:t>.</w:t>
+      </w:r>
+    </w:p>
+    <w:p>
+      <w:r>
+        <w:rPr>
+          <w:noProof/>
+        </w:rPr>
+        <w:drawing>
+          <wp:inline distT="0" distB="0" distL="0" distR="0" wp14:anchorId="2B04EE5C" wp14:editId="429F3E26">
+            <wp:extent cx="5876014" cy="4169244"/>
+            <wp:effectExtent l="0" t="0" r="0" b="3175"/>
+            <wp:docPr id="284051532" name="Picture 1"/>
+            <wp:cNvGraphicFramePr>
+              <a:graphicFrameLocks xmlns:a="http://schemas.openxmlformats.org/drawingml/2006/main" noChangeAspect="1"/>
+            </wp:cNvGraphicFramePr>
+            <a:graphic xmlns:a="http://schemas.openxmlformats.org/drawingml/2006/main">
+              <a:graphicData uri="http://schemas.openxmlformats.org/drawingml/2006/picture">
+                <pic:pic xmlns:pic="http://schemas.openxmlformats.org/drawingml/2006/picture">
+                  <pic:nvPicPr>
+                    <pic:cNvPr id="0" name="Picture 1"/>
                     <pic:cNvPicPr>
                       <a:picLocks noChangeAspect="1" noChangeArrowheads="1"/>
                     </pic:cNvPicPr>
                   </pic:nvPicPr>
                   <pic:blipFill>
-                    <a:blip r:embed="rId38">
+                    <a:blip r:embed="rId43">
                       <a:extLst>
                         <a:ext uri="{28A0092B-C50C-407E-A947-70E740481C1C}">
                           <a14:useLocalDpi xmlns:a14="http://schemas.microsoft.com/office/drawing/2010/main" val="0"/>
@@ -3798,7 +4172,7 @@
                   <pic:spPr bwMode="auto">
                     <a:xfrm>
                       <a:off x="0" y="0"/>
-                      <a:ext cx="5907468" cy="4688107"/>
+                      <a:ext cx="5887926" cy="4177696"/>
                     </a:xfrm>
                     <a:prstGeom prst="rect">
                       <a:avLst/>
@@ -3815,12 +4189,1044 @@
         </w:drawing>
       </w:r>
     </w:p>
+    <w:p>
+      <w:pPr>
+        <w:pStyle w:val="Heading3"/>
+      </w:pPr>
+      <w:proofErr w:type="spellStart"/>
+      <w:r>
+        <w:t>wirecutter</w:t>
+      </w:r>
+      <w:proofErr w:type="spellEnd"/>
+    </w:p>
+    <w:p>
+      <w:r>
+        <w:t xml:space="preserve">This tag represents the on and off state of the </w:t>
+      </w:r>
+      <w:proofErr w:type="spellStart"/>
+      <w:r>
+        <w:t>wirecutter</w:t>
+      </w:r>
+      <w:proofErr w:type="spellEnd"/>
+      <w:r>
+        <w:t>, which cuts the cookie dough into puck size.</w:t>
+      </w:r>
+      <w:r>
+        <w:t xml:space="preserve"> The </w:t>
+      </w:r>
+      <w:proofErr w:type="spellStart"/>
+      <w:r>
+        <w:t>wirecutter</w:t>
+      </w:r>
+      <w:proofErr w:type="spellEnd"/>
+      <w:r>
+        <w:t xml:space="preserve"> is cutting the dough if the value is set to 1, if the value Is set to 0 it is not cutting.</w:t>
+      </w:r>
+    </w:p>
+    <w:p>
+      <w:pPr>
+        <w:pStyle w:val="Heading3"/>
+      </w:pPr>
+      <w:proofErr w:type="spellStart"/>
+      <w:r>
+        <w:t>trough_weight</w:t>
+      </w:r>
+      <w:proofErr w:type="spellEnd"/>
+    </w:p>
+    <w:p>
+      <w:r>
+        <w:t xml:space="preserve">This tag represents the total weight of dough in the trough currently and decreases as the </w:t>
+      </w:r>
+      <w:proofErr w:type="spellStart"/>
+      <w:r>
+        <w:t>wirecutter</w:t>
+      </w:r>
+      <w:proofErr w:type="spellEnd"/>
+      <w:r>
+        <w:t xml:space="preserve"> cuts.</w:t>
+      </w:r>
+    </w:p>
+    <w:p>
+      <w:pPr>
+        <w:pStyle w:val="Heading3"/>
+      </w:pPr>
+      <w:proofErr w:type="spellStart"/>
+      <w:r>
+        <w:t>wirecut_cpm</w:t>
+      </w:r>
+      <w:proofErr w:type="spellEnd"/>
+    </w:p>
+    <w:p>
+      <w:r>
+        <w:t xml:space="preserve">This tag represents the </w:t>
+      </w:r>
+      <w:proofErr w:type="spellStart"/>
+      <w:r>
+        <w:t>wirecutters</w:t>
+      </w:r>
+      <w:proofErr w:type="spellEnd"/>
+      <w:r>
+        <w:t xml:space="preserve"> cuts per minute.</w:t>
+      </w:r>
+    </w:p>
+    <w:p>
+      <w:pPr>
+        <w:pStyle w:val="Heading3"/>
+      </w:pPr>
+      <w:proofErr w:type="spellStart"/>
+      <w:r>
+        <w:t>papercut_cpm</w:t>
+      </w:r>
+      <w:proofErr w:type="spellEnd"/>
+    </w:p>
+    <w:p>
+      <w:r>
+        <w:t>This tag represents the paper cutter cuts per minute.</w:t>
+      </w:r>
+    </w:p>
+    <w:p>
+      <w:pPr>
+        <w:pStyle w:val="Heading3"/>
+      </w:pPr>
+      <w:proofErr w:type="spellStart"/>
+      <w:r>
+        <w:lastRenderedPageBreak/>
+        <w:t>paper_cutter</w:t>
+      </w:r>
+      <w:proofErr w:type="spellEnd"/>
+    </w:p>
+    <w:p>
+      <w:r>
+        <w:t>This tag represents the on and off state of the paper cutter, which cuts the pucks of dough on parchment paper into different sheets.</w:t>
+      </w:r>
+      <w:r>
+        <w:t xml:space="preserve"> </w:t>
+      </w:r>
+      <w:r>
+        <w:t xml:space="preserve">The </w:t>
+      </w:r>
+      <w:r>
+        <w:t>paper cutter</w:t>
+      </w:r>
+      <w:r>
+        <w:t xml:space="preserve"> is cutting the </w:t>
+      </w:r>
+      <w:r>
+        <w:t>paper</w:t>
+      </w:r>
+      <w:r>
+        <w:t xml:space="preserve"> if the value is set to 1, if the value Is set to 0 it is not cutting.</w:t>
+      </w:r>
+    </w:p>
+    <w:p>
+      <w:pPr>
+        <w:pStyle w:val="Heading3"/>
+      </w:pPr>
+      <w:r>
+        <w:t>conveyor</w:t>
+      </w:r>
+    </w:p>
+    <w:p>
+      <w:r>
+        <w:t>This tag represents the on and off state of the conveyor belt which carries the sheets of dough pucks through the nitrogen tunnel to the finished good area.</w:t>
+      </w:r>
+      <w:r>
+        <w:t xml:space="preserve"> If the value is 1 the conveyor is moving, if the value is 0 then the conveyor is no longer moving.</w:t>
+      </w:r>
+    </w:p>
+    <w:p>
+      <w:pPr>
+        <w:pStyle w:val="Heading3"/>
+      </w:pPr>
+      <w:proofErr w:type="spellStart"/>
+      <w:r>
+        <w:t>conveyor_fpm</w:t>
+      </w:r>
+      <w:proofErr w:type="spellEnd"/>
+    </w:p>
+    <w:p>
+      <w:r>
+        <w:t xml:space="preserve">This tag represents the conveyor feet per minute, or how fast the cookies are traveling down the line. </w:t>
+      </w:r>
+      <w:r>
+        <w:t>This tag is always set to 0 when the conveyor is off.</w:t>
+      </w:r>
+    </w:p>
+    <w:p>
+      <w:pPr>
+        <w:pStyle w:val="Heading3"/>
+      </w:pPr>
+      <w:proofErr w:type="spellStart"/>
+      <w:r>
+        <w:t>tunnel_temp</w:t>
+      </w:r>
+      <w:proofErr w:type="spellEnd"/>
+    </w:p>
+    <w:p>
+      <w:r>
+        <w:t>This tag represents the temperature of the nitrogen tunnel, it fluctuates based on the input of nitrogen and how many fans are on, particularly if the exhaust fan is on.</w:t>
+      </w:r>
+    </w:p>
+    <w:p>
+      <w:pPr>
+        <w:pStyle w:val="Heading3"/>
+      </w:pPr>
+      <w:r>
+        <w:t>gv_1</w:t>
+      </w:r>
+    </w:p>
+    <w:p>
+      <w:r>
+        <w:t>This tag represents the open and closed state of the gas valve which regulates the nitrogen in the tunnel freezing system. The gas valve is open if the value is set to 1 and close if it is set to 0.</w:t>
+      </w:r>
+    </w:p>
+    <w:p>
+      <w:pPr>
+        <w:pStyle w:val="Heading3"/>
+      </w:pPr>
+      <w:r>
+        <w:t>fan_1</w:t>
+      </w:r>
+    </w:p>
+    <w:p>
+      <w:r>
+        <w:t xml:space="preserve">This tag represents the on and off state for fan number 1. The blades of the fan are spinning if the value is set to 1 or not spinning if the </w:t>
+      </w:r>
+      <w:r>
+        <w:t xml:space="preserve">value </w:t>
+      </w:r>
+      <w:r>
+        <w:t>is set to 0.</w:t>
+      </w:r>
+    </w:p>
+    <w:p>
+      <w:pPr>
+        <w:pStyle w:val="Heading3"/>
+      </w:pPr>
+      <w:r>
+        <w:t>fan_</w:t>
+      </w:r>
+      <w:r>
+        <w:t>2</w:t>
+      </w:r>
+    </w:p>
+    <w:p>
+      <w:r>
+        <w:t xml:space="preserve">This tag represents the on and off state for fan number </w:t>
+      </w:r>
+      <w:r>
+        <w:t xml:space="preserve">2. </w:t>
+      </w:r>
+      <w:r>
+        <w:t>The blades of the fan are spinning if the value is set to 1 or not spinning if the value is set to 0.</w:t>
+      </w:r>
+    </w:p>
+    <w:p>
+      <w:pPr>
+        <w:pStyle w:val="Heading3"/>
+      </w:pPr>
+      <w:r>
+        <w:t>fan_</w:t>
+      </w:r>
+      <w:r>
+        <w:t>3</w:t>
+      </w:r>
+    </w:p>
+    <w:p>
+      <w:r>
+        <w:t xml:space="preserve">This tag represents the on and off state for fan number </w:t>
+      </w:r>
+      <w:r>
+        <w:t xml:space="preserve">3. </w:t>
+      </w:r>
+      <w:r>
+        <w:t>The blades of the fan are spinning if the value is set to 1 or not spinning if the value is set to 0.</w:t>
+      </w:r>
+    </w:p>
+    <w:p>
+      <w:pPr>
+        <w:pStyle w:val="Heading3"/>
+      </w:pPr>
+      <w:proofErr w:type="spellStart"/>
+      <w:r>
+        <w:lastRenderedPageBreak/>
+        <w:t>exhaust_fan</w:t>
+      </w:r>
+      <w:proofErr w:type="spellEnd"/>
+    </w:p>
+    <w:p>
+      <w:r>
+        <w:t xml:space="preserve">This tag represents the on and off state for the exhaust fan. </w:t>
+      </w:r>
+      <w:r>
+        <w:t>The blades of the fan are spinning if the value is set to 1 or not spinning if the value is set to 0.</w:t>
+      </w:r>
+    </w:p>
+    <w:p>
+      <w:pPr>
+        <w:pStyle w:val="Heading3"/>
+      </w:pPr>
+      <w:proofErr w:type="spellStart"/>
+      <w:r>
+        <w:t>nitrogen_volume</w:t>
+      </w:r>
+      <w:proofErr w:type="spellEnd"/>
+    </w:p>
+    <w:p>
+      <w:r>
+        <w:t>This tag represents the total amount of nitrogen currently in the nitrogen tank.</w:t>
+      </w:r>
+    </w:p>
+    <w:p/>
+    <w:p>
+      <w:r>
+        <w:t>The location of all visual elements and their relevant tags can be seen below for the “</w:t>
+      </w:r>
+      <w:proofErr w:type="spellStart"/>
+      <w:r>
+        <w:t>ProductionArea</w:t>
+      </w:r>
+      <w:proofErr w:type="spellEnd"/>
+      <w:r>
+        <w:t>” view.</w:t>
+      </w:r>
+    </w:p>
+    <w:p>
+      <w:r>
+        <w:rPr>
+          <w:noProof/>
+        </w:rPr>
+        <w:drawing>
+          <wp:inline distT="0" distB="0" distL="0" distR="0" wp14:anchorId="62BF4848" wp14:editId="089A82BD">
+            <wp:extent cx="5943600" cy="3497580"/>
+            <wp:effectExtent l="0" t="0" r="0" b="7620"/>
+            <wp:docPr id="1677875582" name="Picture 2"/>
+            <wp:cNvGraphicFramePr>
+              <a:graphicFrameLocks xmlns:a="http://schemas.openxmlformats.org/drawingml/2006/main" noChangeAspect="1"/>
+            </wp:cNvGraphicFramePr>
+            <a:graphic xmlns:a="http://schemas.openxmlformats.org/drawingml/2006/main">
+              <a:graphicData uri="http://schemas.openxmlformats.org/drawingml/2006/picture">
+                <pic:pic xmlns:pic="http://schemas.openxmlformats.org/drawingml/2006/picture">
+                  <pic:nvPicPr>
+                    <pic:cNvPr id="0" name="Picture 2"/>
+                    <pic:cNvPicPr>
+                      <a:picLocks noChangeAspect="1" noChangeArrowheads="1"/>
+                    </pic:cNvPicPr>
+                  </pic:nvPicPr>
+                  <pic:blipFill>
+                    <a:blip r:embed="rId44">
+                      <a:extLst>
+                        <a:ext uri="{28A0092B-C50C-407E-A947-70E740481C1C}">
+                          <a14:useLocalDpi xmlns:a14="http://schemas.microsoft.com/office/drawing/2010/main" val="0"/>
+                        </a:ext>
+                      </a:extLst>
+                    </a:blip>
+                    <a:srcRect/>
+                    <a:stretch>
+                      <a:fillRect/>
+                    </a:stretch>
+                  </pic:blipFill>
+                  <pic:spPr bwMode="auto">
+                    <a:xfrm>
+                      <a:off x="0" y="0"/>
+                      <a:ext cx="5943600" cy="3497580"/>
+                    </a:xfrm>
+                    <a:prstGeom prst="rect">
+                      <a:avLst/>
+                    </a:prstGeom>
+                    <a:noFill/>
+                    <a:ln>
+                      <a:noFill/>
+                    </a:ln>
+                  </pic:spPr>
+                </pic:pic>
+              </a:graphicData>
+            </a:graphic>
+          </wp:inline>
+        </w:drawing>
+      </w:r>
+    </w:p>
+    <w:p/>
+    <w:p>
+      <w:pPr>
+        <w:pStyle w:val="Heading3"/>
+      </w:pPr>
+      <w:r>
+        <w:t>conveyor_1</w:t>
+      </w:r>
+    </w:p>
+    <w:p>
+      <w:r>
+        <w:t>This tag represents the on and off state for conveyor_1, the conveyor from the box maker to the bag inserter. If the value is set to 1 then the conveyor is on if the value is set to 0 then the conveyor is off.</w:t>
+      </w:r>
+    </w:p>
+    <w:p>
+      <w:pPr>
+        <w:pStyle w:val="Heading3"/>
+      </w:pPr>
+      <w:r>
+        <w:lastRenderedPageBreak/>
+        <w:t>conveyor_</w:t>
+      </w:r>
+      <w:r>
+        <w:t>2</w:t>
+      </w:r>
+    </w:p>
+    <w:p>
+      <w:r>
+        <w:t>This tag represents the on and off state for conveyor_</w:t>
+      </w:r>
+      <w:r>
+        <w:t>2</w:t>
+      </w:r>
+      <w:r>
+        <w:t xml:space="preserve">, the conveyor from the </w:t>
+      </w:r>
+      <w:r>
+        <w:t>bag inserter</w:t>
+      </w:r>
+      <w:r>
+        <w:t xml:space="preserve"> to the </w:t>
+      </w:r>
+      <w:r>
+        <w:t>packing area</w:t>
+      </w:r>
+      <w:r>
+        <w:t>. If the value is set to 1 then the conveyor is on if the value is set to 0 then the conveyor is off.</w:t>
+      </w:r>
+    </w:p>
+    <w:p>
+      <w:pPr>
+        <w:pStyle w:val="Heading3"/>
+      </w:pPr>
+      <w:r>
+        <w:t>conveyor_</w:t>
+      </w:r>
+      <w:r>
+        <w:t>3</w:t>
+      </w:r>
+    </w:p>
+    <w:p>
+      <w:r>
+        <w:t>This tag represents the on and off state for conveyor_</w:t>
+      </w:r>
+      <w:r>
+        <w:t>3</w:t>
+      </w:r>
+      <w:r>
+        <w:t xml:space="preserve">, the conveyor from the </w:t>
+      </w:r>
+      <w:r>
+        <w:t>packing area</w:t>
+      </w:r>
+      <w:r>
+        <w:t xml:space="preserve"> to the </w:t>
+      </w:r>
+      <w:r>
+        <w:t>box taper</w:t>
+      </w:r>
+      <w:r>
+        <w:t>. If the value is set to 1 then the conveyor is on if the value is set to 0 then the conveyor is off.</w:t>
+      </w:r>
+    </w:p>
+    <w:p>
+      <w:pPr>
+        <w:pStyle w:val="Heading3"/>
+      </w:pPr>
+      <w:r>
+        <w:t>conveyor_</w:t>
+      </w:r>
+      <w:r>
+        <w:t>4</w:t>
+      </w:r>
+    </w:p>
+    <w:p>
+      <w:r>
+        <w:t>This tag represents the on and off state for conveyor_</w:t>
+      </w:r>
+      <w:r>
+        <w:t>4</w:t>
+      </w:r>
+      <w:r>
+        <w:t xml:space="preserve">, the conveyor from the box </w:t>
+      </w:r>
+      <w:r>
+        <w:t>taper</w:t>
+      </w:r>
+      <w:r>
+        <w:t xml:space="preserve"> to the </w:t>
+      </w:r>
+      <w:r>
+        <w:t>palletizer</w:t>
+      </w:r>
+      <w:r>
+        <w:t>. If the value is set to 1 then the conveyor is on if the value is set to 0 then the conveyor is off.</w:t>
+      </w:r>
+    </w:p>
+    <w:p>
+      <w:pPr>
+        <w:pStyle w:val="Heading3"/>
+      </w:pPr>
+      <w:r>
+        <w:t>conveyor_</w:t>
+      </w:r>
+      <w:r>
+        <w:t>5</w:t>
+      </w:r>
+    </w:p>
+    <w:p>
+      <w:r>
+        <w:t>This tag represents the on and off state for conveyor_</w:t>
+      </w:r>
+      <w:r>
+        <w:t>5</w:t>
+      </w:r>
+      <w:r>
+        <w:t xml:space="preserve">, the conveyor from the </w:t>
+      </w:r>
+      <w:r>
+        <w:t>palletizer</w:t>
+      </w:r>
+      <w:r>
+        <w:t xml:space="preserve"> to the </w:t>
+      </w:r>
+      <w:r>
+        <w:t>forklift pick up spot</w:t>
+      </w:r>
+      <w:r>
+        <w:t>. If the value is set to 1 then the conveyor is on if the value is set to 0 then the conveyor is off.</w:t>
+      </w:r>
+    </w:p>
+    <w:p>
+      <w:pPr>
+        <w:pStyle w:val="Heading3"/>
+      </w:pPr>
+      <w:r>
+        <w:t>convey</w:t>
+      </w:r>
+      <w:r>
+        <w:t>ing</w:t>
+      </w:r>
+      <w:r>
+        <w:t>_1</w:t>
+      </w:r>
+    </w:p>
+    <w:p>
+      <w:r>
+        <w:t xml:space="preserve">This tag represents the </w:t>
+      </w:r>
+      <w:r>
+        <w:t>conveying</w:t>
+      </w:r>
+      <w:r>
+        <w:t xml:space="preserve"> state for conveyor_</w:t>
+      </w:r>
+      <w:r>
+        <w:t>1</w:t>
+      </w:r>
+      <w:r>
+        <w:t xml:space="preserve">. If the value is set to 1 then the conveyor </w:t>
+      </w:r>
+      <w:proofErr w:type="gramStart"/>
+      <w:r>
+        <w:t>moving</w:t>
+      </w:r>
+      <w:proofErr w:type="gramEnd"/>
+      <w:r>
+        <w:t xml:space="preserve"> </w:t>
+      </w:r>
+      <w:r>
+        <w:t xml:space="preserve">if the value is set to 0 then the conveyor is </w:t>
+      </w:r>
+      <w:r>
+        <w:t>not moving</w:t>
+      </w:r>
+      <w:r>
+        <w:t>.</w:t>
+      </w:r>
+      <w:r>
+        <w:t xml:space="preserve"> If conveyor_1 is set to 0 then conveying_1 is set to 0 as well. </w:t>
+      </w:r>
+    </w:p>
+    <w:p>
+      <w:pPr>
+        <w:pStyle w:val="Heading3"/>
+      </w:pPr>
+      <w:r>
+        <w:t>conveying_</w:t>
+      </w:r>
+      <w:r>
+        <w:t>2</w:t>
+      </w:r>
+    </w:p>
+    <w:p>
+      <w:r>
+        <w:t>This tag represents the conveying state for conveyor_</w:t>
+      </w:r>
+      <w:r>
+        <w:t>2</w:t>
+      </w:r>
+      <w:r>
+        <w:t xml:space="preserve">. If the value is set to 1 then the conveyor </w:t>
+      </w:r>
+      <w:proofErr w:type="gramStart"/>
+      <w:r>
+        <w:t>moving</w:t>
+      </w:r>
+      <w:proofErr w:type="gramEnd"/>
+      <w:r>
+        <w:t xml:space="preserve"> if the value is set to 0 then the conveyor is not moving. If conveyor_</w:t>
+      </w:r>
+      <w:r>
+        <w:t>2</w:t>
+      </w:r>
+      <w:r>
+        <w:t xml:space="preserve"> is set to 0 then </w:t>
+      </w:r>
+      <w:proofErr w:type="gramStart"/>
+      <w:r>
+        <w:t>conveying</w:t>
+      </w:r>
+      <w:proofErr w:type="gramEnd"/>
+      <w:r>
+        <w:t>_</w:t>
+      </w:r>
+      <w:r>
+        <w:t>2</w:t>
+      </w:r>
+      <w:r>
+        <w:t xml:space="preserve"> is set to 0 as well. </w:t>
+      </w:r>
+    </w:p>
+    <w:p>
+      <w:pPr>
+        <w:pStyle w:val="Heading3"/>
+      </w:pPr>
+      <w:r>
+        <w:t>conveying_</w:t>
+      </w:r>
+      <w:r>
+        <w:t>3</w:t>
+      </w:r>
+    </w:p>
+    <w:p>
+      <w:r>
+        <w:t>This tag represents the conveying state for conveyor_</w:t>
+      </w:r>
+      <w:r>
+        <w:t>3</w:t>
+      </w:r>
+      <w:r>
+        <w:t xml:space="preserve">. If the value is set to 1 then the conveyor </w:t>
+      </w:r>
+      <w:proofErr w:type="gramStart"/>
+      <w:r>
+        <w:t>moving</w:t>
+      </w:r>
+      <w:proofErr w:type="gramEnd"/>
+      <w:r>
+        <w:t xml:space="preserve"> if the value is set to 0 then the conveyor is not moving. If conveyor_</w:t>
+      </w:r>
+      <w:r>
+        <w:t>3</w:t>
+      </w:r>
+      <w:r>
+        <w:t xml:space="preserve"> is set to 0 then conveying_</w:t>
+      </w:r>
+      <w:r>
+        <w:t>3</w:t>
+      </w:r>
+      <w:r>
+        <w:t xml:space="preserve"> is set to 0 as well. </w:t>
+      </w:r>
+    </w:p>
+    <w:p>
+      <w:pPr>
+        <w:pStyle w:val="Heading3"/>
+      </w:pPr>
+      <w:r>
+        <w:lastRenderedPageBreak/>
+        <w:t>conveying_</w:t>
+      </w:r>
+      <w:r>
+        <w:t>4</w:t>
+      </w:r>
+    </w:p>
+    <w:p>
+      <w:r>
+        <w:t>This tag represents the conveying state for conveyor_</w:t>
+      </w:r>
+      <w:r>
+        <w:t>4</w:t>
+      </w:r>
+      <w:r>
+        <w:t xml:space="preserve">. If the value is set to 1 then the conveyor </w:t>
+      </w:r>
+      <w:proofErr w:type="gramStart"/>
+      <w:r>
+        <w:t>moving</w:t>
+      </w:r>
+      <w:proofErr w:type="gramEnd"/>
+      <w:r>
+        <w:t xml:space="preserve"> if the value is set to 0 then the conveyor is not moving. If conveyor_</w:t>
+      </w:r>
+      <w:r>
+        <w:t>4</w:t>
+      </w:r>
+      <w:r>
+        <w:t xml:space="preserve"> is set to 0 then conveying_</w:t>
+      </w:r>
+      <w:r>
+        <w:t>4</w:t>
+      </w:r>
+      <w:r>
+        <w:t xml:space="preserve"> is set to 0 as well. </w:t>
+      </w:r>
+    </w:p>
+    <w:p>
+      <w:pPr>
+        <w:pStyle w:val="Heading3"/>
+      </w:pPr>
+      <w:r>
+        <w:t>conveying_</w:t>
+      </w:r>
+      <w:r>
+        <w:t>5</w:t>
+      </w:r>
+    </w:p>
+    <w:p>
+      <w:r>
+        <w:t>This tag represents the conveying state for conveyor_</w:t>
+      </w:r>
+      <w:r>
+        <w:t>5</w:t>
+      </w:r>
+      <w:r>
+        <w:t xml:space="preserve">. If the value is set to 1 then the conveyor </w:t>
+      </w:r>
+      <w:proofErr w:type="gramStart"/>
+      <w:r>
+        <w:t>moving</w:t>
+      </w:r>
+      <w:proofErr w:type="gramEnd"/>
+      <w:r>
+        <w:t xml:space="preserve"> if the value is set to 0 then the conveyor is not moving. If conveyor_</w:t>
+      </w:r>
+      <w:r>
+        <w:t>5</w:t>
+      </w:r>
+      <w:r>
+        <w:t xml:space="preserve"> is set to 0 then conveying_</w:t>
+      </w:r>
+      <w:r>
+        <w:t>5</w:t>
+      </w:r>
+      <w:r>
+        <w:t xml:space="preserve"> is set to 0 as well.</w:t>
+      </w:r>
+    </w:p>
+    <w:p>
+      <w:pPr>
+        <w:pStyle w:val="Heading3"/>
+      </w:pPr>
+      <w:r>
+        <w:t>boxing</w:t>
+      </w:r>
+      <w:r>
+        <w:t xml:space="preserve"> </w:t>
+      </w:r>
+    </w:p>
+    <w:p>
+      <w:r>
+        <w:t>This tag represents whether the box maker is making a box or not. If the value is set to 1 then the box maker is making a box, if the value is set to 0 then the box maker is not making a box.</w:t>
+      </w:r>
+    </w:p>
+    <w:p>
+      <w:pPr>
+        <w:pStyle w:val="Heading3"/>
+      </w:pPr>
+      <w:proofErr w:type="spellStart"/>
+      <w:r>
+        <w:t>box_maker</w:t>
+      </w:r>
+      <w:proofErr w:type="spellEnd"/>
+    </w:p>
+    <w:p>
+      <w:r>
+        <w:t>This tag represents the on and off state of the box maker. If the value is set to 1 then the box maker is on, if the value is set to 0 then the box maker is off.</w:t>
+      </w:r>
+    </w:p>
+    <w:p>
+      <w:pPr>
+        <w:pStyle w:val="Heading3"/>
+      </w:pPr>
+      <w:r>
+        <w:t>bagger</w:t>
+      </w:r>
+    </w:p>
+    <w:p>
+      <w:r>
+        <w:t xml:space="preserve">This tag represents the on and off state of the </w:t>
+      </w:r>
+      <w:r>
+        <w:t>bag inserter</w:t>
+      </w:r>
+      <w:r>
+        <w:t>. If the value is set to 1 then the bag inserter is on, if the value is set to 0 then the bag inserter is off.</w:t>
+      </w:r>
+    </w:p>
+    <w:p>
+      <w:pPr>
+        <w:pStyle w:val="Heading3"/>
+      </w:pPr>
+      <w:proofErr w:type="spellStart"/>
+      <w:r>
+        <w:t>worker_present</w:t>
+      </w:r>
+      <w:proofErr w:type="spellEnd"/>
+    </w:p>
+    <w:p>
+      <w:r>
+        <w:t xml:space="preserve">This tag shows whether the worker is present </w:t>
+      </w:r>
+      <w:proofErr w:type="gramStart"/>
+      <w:r>
+        <w:t>at</w:t>
+      </w:r>
+      <w:proofErr w:type="gramEnd"/>
+      <w:r>
+        <w:t xml:space="preserve"> the packing area or not. If the value is set to 1 then the worker is present and is packing if there are cookie sheets/boxes available, if the value is set to 0 then the worker is not present at the packing station.</w:t>
+      </w:r>
+    </w:p>
+    <w:p>
+      <w:pPr>
+        <w:pStyle w:val="Heading3"/>
+      </w:pPr>
+      <w:r>
+        <w:t>taper</w:t>
+      </w:r>
+    </w:p>
+    <w:p>
+      <w:r>
+        <w:t>This tag represents the on and off state of the box taper. If the value is set to 1 then the box taper is on, if the value is set to 0 then the box taper is off.</w:t>
+      </w:r>
+    </w:p>
+    <w:p>
+      <w:pPr>
+        <w:pStyle w:val="Heading3"/>
+      </w:pPr>
+      <w:r>
+        <w:t>palletizer</w:t>
+      </w:r>
+    </w:p>
+    <w:p>
+      <w:r>
+        <w:t xml:space="preserve">This tag represents the on and off state of the palletizer. If the value is set to 1 then the palletizer is on, if the value is set to 0 then the palletizer is off. </w:t>
+      </w:r>
+    </w:p>
+    <w:p>
+      <w:pPr>
+        <w:pStyle w:val="Heading3"/>
+      </w:pPr>
+      <w:proofErr w:type="spellStart"/>
+      <w:r>
+        <w:lastRenderedPageBreak/>
+        <w:t>palletizer_grabbing</w:t>
+      </w:r>
+      <w:proofErr w:type="spellEnd"/>
+    </w:p>
+    <w:p>
+      <w:r>
+        <w:t>This tag represents whether the palletizer is grabbing a box or not. If the value is set to 1 then the palletizer is grabbing a box, if the value is set to 0 then the palletizer is not grabbing a box.</w:t>
+      </w:r>
+    </w:p>
+    <w:p>
+      <w:pPr>
+        <w:pStyle w:val="Heading3"/>
+      </w:pPr>
+      <w:proofErr w:type="spellStart"/>
+      <w:r>
+        <w:t>palletizer_moving</w:t>
+      </w:r>
+      <w:proofErr w:type="spellEnd"/>
+    </w:p>
+    <w:p>
+      <w:r>
+        <w:t xml:space="preserve">This tag represents whether the palletizer is moving or not. If the value is set to 1 then the palletizer is moving, if the value is set to 0 then the palletizer is not moving. </w:t>
+      </w:r>
+    </w:p>
+    <w:p>
+      <w:pPr>
+        <w:pStyle w:val="Heading3"/>
+      </w:pPr>
+      <w:proofErr w:type="spellStart"/>
+      <w:r>
+        <w:t>palletizer_rotation</w:t>
+      </w:r>
+      <w:proofErr w:type="spellEnd"/>
+    </w:p>
+    <w:p>
+      <w:r>
+        <w:t>This tag represents the angle at which the palletizer arm is rotated. The angle changes based on if the palletizer is moving and/or grabbing a box.</w:t>
+      </w:r>
+    </w:p>
+    <w:p>
+      <w:pPr>
+        <w:pStyle w:val="Heading3"/>
+      </w:pPr>
+      <w:r>
+        <w:t>roe_1</w:t>
+      </w:r>
+    </w:p>
+    <w:p>
+      <w:r>
+        <w:t xml:space="preserve">This tag represents a sensor on the palletizer which is set to true when the </w:t>
+      </w:r>
+      <w:proofErr w:type="spellStart"/>
+      <w:r>
+        <w:t>palletizer_rotation</w:t>
+      </w:r>
+      <w:proofErr w:type="spellEnd"/>
+      <w:r>
+        <w:t xml:space="preserve"> is equal to 130 degrees.</w:t>
+      </w:r>
+    </w:p>
+    <w:p>
+      <w:pPr>
+        <w:pStyle w:val="Heading3"/>
+      </w:pPr>
+      <w:r>
+        <w:t>roe_</w:t>
+      </w:r>
+      <w:r>
+        <w:t>2</w:t>
+      </w:r>
+    </w:p>
+    <w:p>
+      <w:r>
+        <w:t xml:space="preserve">This tag represents a sensor on the palletizer which is set to true when the </w:t>
+      </w:r>
+      <w:proofErr w:type="spellStart"/>
+      <w:r>
+        <w:t>palletizer_rotation</w:t>
+      </w:r>
+      <w:proofErr w:type="spellEnd"/>
+      <w:r>
+        <w:t xml:space="preserve"> is equal to 1</w:t>
+      </w:r>
+      <w:r>
+        <w:t>8</w:t>
+      </w:r>
+      <w:r>
+        <w:t>0 degrees.</w:t>
+      </w:r>
+    </w:p>
+    <w:p>
+      <w:pPr>
+        <w:pStyle w:val="Heading3"/>
+      </w:pPr>
+      <w:r>
+        <w:t>roe_</w:t>
+      </w:r>
+      <w:r>
+        <w:t>3</w:t>
+      </w:r>
+    </w:p>
+    <w:p>
+      <w:r>
+        <w:t xml:space="preserve">This tag represents a sensor on the palletizer which is set to true when the </w:t>
+      </w:r>
+      <w:proofErr w:type="spellStart"/>
+      <w:r>
+        <w:t>palletizer_rotation</w:t>
+      </w:r>
+      <w:proofErr w:type="spellEnd"/>
+      <w:r>
+        <w:t xml:space="preserve"> is equal to </w:t>
+      </w:r>
+      <w:r>
+        <w:t>225</w:t>
+      </w:r>
+      <w:r>
+        <w:t xml:space="preserve"> degrees.</w:t>
+      </w:r>
+    </w:p>
+    <w:p/>
+    <w:p>
+      <w:r>
+        <w:t>The location of all visual elements and their relevant tags can be seen below for the “</w:t>
+      </w:r>
+      <w:proofErr w:type="spellStart"/>
+      <w:r>
+        <w:t>FinishedGood</w:t>
+      </w:r>
+      <w:proofErr w:type="spellEnd"/>
+      <w:r>
+        <w:t>” view.</w:t>
+      </w:r>
+    </w:p>
+    <w:p>
+      <w:r>
+        <w:rPr>
+          <w:noProof/>
+        </w:rPr>
+        <w:lastRenderedPageBreak/>
+        <w:drawing>
+          <wp:inline distT="0" distB="0" distL="0" distR="0" wp14:anchorId="5E3475BE" wp14:editId="295D33F6">
+            <wp:extent cx="5943600" cy="2875915"/>
+            <wp:effectExtent l="0" t="0" r="0" b="635"/>
+            <wp:docPr id="1021109082" name="Picture 5"/>
+            <wp:cNvGraphicFramePr>
+              <a:graphicFrameLocks xmlns:a="http://schemas.openxmlformats.org/drawingml/2006/main" noChangeAspect="1"/>
+            </wp:cNvGraphicFramePr>
+            <a:graphic xmlns:a="http://schemas.openxmlformats.org/drawingml/2006/main">
+              <a:graphicData uri="http://schemas.openxmlformats.org/drawingml/2006/picture">
+                <pic:pic xmlns:pic="http://schemas.openxmlformats.org/drawingml/2006/picture">
+                  <pic:nvPicPr>
+                    <pic:cNvPr id="0" name="Picture 8"/>
+                    <pic:cNvPicPr>
+                      <a:picLocks noChangeAspect="1" noChangeArrowheads="1"/>
+                    </pic:cNvPicPr>
+                  </pic:nvPicPr>
+                  <pic:blipFill>
+                    <a:blip r:embed="rId45" cstate="print">
+                      <a:extLst>
+                        <a:ext uri="{28A0092B-C50C-407E-A947-70E740481C1C}">
+                          <a14:useLocalDpi xmlns:a14="http://schemas.microsoft.com/office/drawing/2010/main" val="0"/>
+                        </a:ext>
+                      </a:extLst>
+                    </a:blip>
+                    <a:srcRect/>
+                    <a:stretch>
+                      <a:fillRect/>
+                    </a:stretch>
+                  </pic:blipFill>
+                  <pic:spPr bwMode="auto">
+                    <a:xfrm>
+                      <a:off x="0" y="0"/>
+                      <a:ext cx="5943600" cy="2875915"/>
+                    </a:xfrm>
+                    <a:prstGeom prst="rect">
+                      <a:avLst/>
+                    </a:prstGeom>
+                    <a:noFill/>
+                    <a:ln>
+                      <a:noFill/>
+                    </a:ln>
+                  </pic:spPr>
+                </pic:pic>
+              </a:graphicData>
+            </a:graphic>
+          </wp:inline>
+        </w:drawing>
+      </w:r>
+    </w:p>
     <w:p/>
     <w:p/>
     <w:p/>
     <w:sectPr>
-      <w:headerReference w:type="default" r:id="rId39"/>
-      <w:footerReference w:type="default" r:id="rId40"/>
+      <w:headerReference w:type="default" r:id="rId46"/>
+      <w:footerReference w:type="default" r:id="rId47"/>
       <w:pgSz w:w="12240" w:h="15840"/>
       <w:pgMar w:top="1440" w:right="1440" w:bottom="1440" w:left="1440" w:header="720" w:footer="720" w:gutter="0"/>
       <w:cols w:space="720"/>
@@ -4706,6 +6112,7 @@
   <w:style w:type="character" w:default="1" w:styleId="DefaultParagraphFont">
     <w:name w:val="Default Paragraph Font"/>
     <w:uiPriority w:val="1"/>
+    <w:semiHidden/>
     <w:unhideWhenUsed/>
   </w:style>
   <w:style w:type="table" w:default="1" w:styleId="TableNormal">
@@ -5482,10 +6889,6 @@
 </file>
 
 <file path=customXml/item1.xml><?xml version="1.0" encoding="utf-8"?>
-<b:Sources xmlns:b="http://schemas.openxmlformats.org/officeDocument/2006/bibliography" xmlns="http://schemas.openxmlformats.org/officeDocument/2006/bibliography" SelectedStyle="\APASixthEditionOfficeOnline.xsl" StyleName="APA" Version="6"/>
-</file>
-
-<file path=customXml/item2.xml><?xml version="1.0" encoding="utf-8"?>
 <ct:contentTypeSchema xmlns:ct="http://schemas.microsoft.com/office/2006/metadata/contentType" xmlns:ma="http://schemas.microsoft.com/office/2006/metadata/properties/metaAttributes" ct:_="" ma:_="" ma:contentTypeName="Document" ma:contentTypeID="0x010100220DF0F4B656194ABEAF63B23F1BF203" ma:contentTypeVersion="14" ma:contentTypeDescription="Create a new document." ma:contentTypeScope="" ma:versionID="28c5dcc7fa5d647195adb7577ec6d9be">
   <xsd:schema xmlns:xsd="http://www.w3.org/2001/XMLSchema" xmlns:xs="http://www.w3.org/2001/XMLSchema" xmlns:p="http://schemas.microsoft.com/office/2006/metadata/properties" xmlns:ns3="e44a40ed-e85e-4f2c-b1ac-db0a34f9719b" xmlns:ns4="bfcfd343-cc05-442d-9cf6-08c710c5536c" targetNamespace="http://schemas.microsoft.com/office/2006/metadata/properties" ma:root="true" ma:fieldsID="92f8c7a85591fbf681f0c6851e1dee80" ns3:_="" ns4:_="">
     <xsd:import namespace="e44a40ed-e85e-4f2c-b1ac-db0a34f9719b"/>
@@ -5712,7 +7115,19 @@
 </ct:contentTypeSchema>
 </file>
 
+<file path=customXml/item2.xml><?xml version="1.0" encoding="utf-8"?>
+<b:Sources xmlns:b="http://schemas.openxmlformats.org/officeDocument/2006/bibliography" xmlns="http://schemas.openxmlformats.org/officeDocument/2006/bibliography" SelectedStyle="\APASixthEditionOfficeOnline.xsl" StyleName="APA" Version="6"/>
+</file>
+
 <file path=customXml/item3.xml><?xml version="1.0" encoding="utf-8"?>
+<p:properties xmlns:p="http://schemas.microsoft.com/office/2006/metadata/properties" xmlns:xsi="http://www.w3.org/2001/XMLSchema-instance" xmlns:pc="http://schemas.microsoft.com/office/infopath/2007/PartnerControls">
+  <documentManagement>
+    <_activity xmlns="e44a40ed-e85e-4f2c-b1ac-db0a34f9719b" xsi:nil="true"/>
+  </documentManagement>
+</p:properties>
+</file>
+
+<file path=customXml/item4.xml><?xml version="1.0" encoding="utf-8"?>
 <?mso-contentType ?>
 <FormTemplates xmlns="http://schemas.microsoft.com/sharepoint/v3/contenttype/forms">
   <Display>DocumentLibraryForm</Display>
@@ -5721,23 +7136,7 @@
 </FormTemplates>
 </file>
 
-<file path=customXml/item4.xml><?xml version="1.0" encoding="utf-8"?>
-<p:properties xmlns:p="http://schemas.microsoft.com/office/2006/metadata/properties" xmlns:xsi="http://www.w3.org/2001/XMLSchema-instance" xmlns:pc="http://schemas.microsoft.com/office/infopath/2007/PartnerControls">
-  <documentManagement>
-    <_activity xmlns="e44a40ed-e85e-4f2c-b1ac-db0a34f9719b" xsi:nil="true"/>
-  </documentManagement>
-</p:properties>
-</file>
-
 <file path=customXml/itemProps1.xml><?xml version="1.0" encoding="utf-8"?>
-<ds:datastoreItem xmlns:ds="http://schemas.openxmlformats.org/officeDocument/2006/customXml" ds:itemID="{75871B79-7D75-4511-B49A-AB0FF4CB930F}">
-  <ds:schemaRefs>
-    <ds:schemaRef ds:uri="http://schemas.openxmlformats.org/officeDocument/2006/bibliography"/>
-  </ds:schemaRefs>
-</ds:datastoreItem>
-</file>
-
-<file path=customXml/itemProps2.xml><?xml version="1.0" encoding="utf-8"?>
 <ds:datastoreItem xmlns:ds="http://schemas.openxmlformats.org/officeDocument/2006/customXml" ds:itemID="{7C6950D5-DE23-40C8-AC83-5C205929904A}">
   <ds:schemaRefs>
     <ds:schemaRef ds:uri="http://schemas.microsoft.com/office/2006/metadata/contentType"/>
@@ -5756,15 +7155,15 @@
 </ds:datastoreItem>
 </file>
 
-<file path=customXml/itemProps3.xml><?xml version="1.0" encoding="utf-8"?>
-<ds:datastoreItem xmlns:ds="http://schemas.openxmlformats.org/officeDocument/2006/customXml" ds:itemID="{B95184DB-AC23-4175-9C08-87FF97BB085B}">
+<file path=customXml/itemProps2.xml><?xml version="1.0" encoding="utf-8"?>
+<ds:datastoreItem xmlns:ds="http://schemas.openxmlformats.org/officeDocument/2006/customXml" ds:itemID="{75871B79-7D75-4511-B49A-AB0FF4CB930F}">
   <ds:schemaRefs>
-    <ds:schemaRef ds:uri="http://schemas.microsoft.com/sharepoint/v3/contenttype/forms"/>
+    <ds:schemaRef ds:uri="http://schemas.openxmlformats.org/officeDocument/2006/bibliography"/>
   </ds:schemaRefs>
 </ds:datastoreItem>
 </file>
 
-<file path=customXml/itemProps4.xml><?xml version="1.0" encoding="utf-8"?>
+<file path=customXml/itemProps3.xml><?xml version="1.0" encoding="utf-8"?>
 <ds:datastoreItem xmlns:ds="http://schemas.openxmlformats.org/officeDocument/2006/customXml" ds:itemID="{094C430D-ABA4-42CE-A14C-E30F0D62B6E7}">
   <ds:schemaRefs>
     <ds:schemaRef ds:uri="http://schemas.microsoft.com/office/2006/metadata/properties"/>
@@ -5772,4 +7171,12 @@
     <ds:schemaRef ds:uri="e44a40ed-e85e-4f2c-b1ac-db0a34f9719b"/>
   </ds:schemaRefs>
 </ds:datastoreItem>
+</file>
+
+<file path=customXml/itemProps4.xml><?xml version="1.0" encoding="utf-8"?>
+<ds:datastoreItem xmlns:ds="http://schemas.openxmlformats.org/officeDocument/2006/customXml" ds:itemID="{B95184DB-AC23-4175-9C08-87FF97BB085B}">
+  <ds:schemaRefs>
+    <ds:schemaRef ds:uri="http://schemas.microsoft.com/sharepoint/v3/contenttype/forms"/>
+  </ds:schemaRefs>
+</ds:datastoreItem>
 </file>
</xml_diff>